<commit_message>
Corregir incoherencias de la Guía 1.5 y la presentación antes de la exposición
- Asignatura: "Portafolio de Título APT122 (Capstone)" en vez de "PTY4614"
- Se retira "20 créditos" (no verificable); la carga de 12-15 h/sem se atribuye al líder, no a cada integrante
- Plan de trabajo: fila "Segunda ronda del modelo" en S12, coherente con el Anexo A y la Gantt
- El frontend arranca en S4 (PR #14): Gantt continua S4-S13, plan "semanas 4 a 7", nota de la lámina 7
- Índice de la Guía actualizado; 17 páginas sin huecos

Co-Authored-By: Claude Fable 5.1 <noreply@anthropic.com>
Claude-Session: https://claude.ai/code/session_01Rvh88dkfXqgVzQiFw1YokL
</commit_message>
<xml_diff>
--- a/Fase 1/Evidencias Grupales/1.5_GuiaEstudiante_Fase 1_Definicion Proyecto APT.docx
+++ b/Fase 1/Evidencias Grupales/1.5_GuiaEstudiante_Fase 1_Definicion Proyecto APT.docx
@@ -145,7 +145,7 @@
         <w:jc w:val="center"/>
       </w:pPr>
       <w:r>
-        <w:t>Asignatura: Capstone (PTY4614)</w:t>
+        <w:t>Asignatura: Portafolio de Título APT122 (Capstone)</w:t>
       </w:r>
     </w:p>
     <w:p>
@@ -198,7 +198,7 @@
         <w:spacing w:before="240" w:after="120" w:line="240" w:lineRule="auto"/>
         <w:outlineLvl w:val="0"/>
       </w:pPr>
-      <w:bookmarkStart w:id="0" w:name="_Toc239624497"/>
+      <w:bookmarkStart w:id="0" w:name="_Toc239669898"/>
       <w:r>
         <w:rPr>
           <w:b/>
@@ -235,7 +235,7 @@
       <w:r>
         <w:fldChar w:fldCharType="separate"/>
       </w:r>
-      <w:hyperlink w:anchor="_Toc239624497" w:history="1">
+      <w:hyperlink w:anchor="_Toc239669898" w:history="1">
         <w:r>
           <w:rPr>
             <w:rStyle w:val="Hipervnculo"/>
@@ -263,7 +263,7 @@
             <w:noProof/>
             <w:webHidden/>
           </w:rPr>
-          <w:instrText xml:space="preserve"> PAGEREF _Toc239624497 \h </w:instrText>
+          <w:instrText xml:space="preserve"> PAGEREF _Toc239669898 \h </w:instrText>
         </w:r>
         <w:r>
           <w:rPr>
@@ -311,7 +311,7 @@
           <w14:ligatures w14:val="standardContextual"/>
         </w:rPr>
       </w:pPr>
-      <w:hyperlink w:anchor="_Toc239624498" w:history="1">
+      <w:hyperlink w:anchor="_Toc239669899" w:history="1">
         <w:r>
           <w:rPr>
             <w:rStyle w:val="Hipervnculo"/>
@@ -339,7 +339,7 @@
             <w:noProof/>
             <w:webHidden/>
           </w:rPr>
-          <w:instrText xml:space="preserve"> PAGEREF _Toc239624498 \h </w:instrText>
+          <w:instrText xml:space="preserve"> PAGEREF _Toc239669899 \h </w:instrText>
         </w:r>
         <w:r>
           <w:rPr>
@@ -387,7 +387,7 @@
           <w14:ligatures w14:val="standardContextual"/>
         </w:rPr>
       </w:pPr>
-      <w:hyperlink w:anchor="_Toc239624499" w:history="1">
+      <w:hyperlink w:anchor="_Toc239669900" w:history="1">
         <w:r>
           <w:rPr>
             <w:rStyle w:val="Hipervnculo"/>
@@ -415,7 +415,7 @@
             <w:noProof/>
             <w:webHidden/>
           </w:rPr>
-          <w:instrText xml:space="preserve"> PAGEREF _Toc239624499 \h </w:instrText>
+          <w:instrText xml:space="preserve"> PAGEREF _Toc239669900 \h </w:instrText>
         </w:r>
         <w:r>
           <w:rPr>
@@ -463,7 +463,7 @@
           <w14:ligatures w14:val="standardContextual"/>
         </w:rPr>
       </w:pPr>
-      <w:hyperlink w:anchor="_Toc239624500" w:history="1">
+      <w:hyperlink w:anchor="_Toc239669901" w:history="1">
         <w:r>
           <w:rPr>
             <w:rStyle w:val="Hipervnculo"/>
@@ -491,7 +491,7 @@
             <w:noProof/>
             <w:webHidden/>
           </w:rPr>
-          <w:instrText xml:space="preserve"> PAGEREF _Toc239624500 \h </w:instrText>
+          <w:instrText xml:space="preserve"> PAGEREF _Toc239669901 \h </w:instrText>
         </w:r>
         <w:r>
           <w:rPr>
@@ -540,7 +540,7 @@
           <w14:ligatures w14:val="standardContextual"/>
         </w:rPr>
       </w:pPr>
-      <w:hyperlink w:anchor="_Toc239624501" w:history="1">
+      <w:hyperlink w:anchor="_Toc239669902" w:history="1">
         <w:r>
           <w:rPr>
             <w:rStyle w:val="Hipervnculo"/>
@@ -592,7 +592,7 @@
             <w:noProof/>
             <w:webHidden/>
           </w:rPr>
-          <w:instrText xml:space="preserve"> PAGEREF _Toc239624501 \h </w:instrText>
+          <w:instrText xml:space="preserve"> PAGEREF _Toc239669902 \h </w:instrText>
         </w:r>
         <w:r>
           <w:rPr>
@@ -640,7 +640,7 @@
           <w14:ligatures w14:val="standardContextual"/>
         </w:rPr>
       </w:pPr>
-      <w:hyperlink w:anchor="_Toc239624502" w:history="1">
+      <w:hyperlink w:anchor="_Toc239669903" w:history="1">
         <w:r>
           <w:rPr>
             <w:rStyle w:val="Hipervnculo"/>
@@ -668,7 +668,7 @@
             <w:noProof/>
             <w:webHidden/>
           </w:rPr>
-          <w:instrText xml:space="preserve"> PAGEREF _Toc239624502 \h </w:instrText>
+          <w:instrText xml:space="preserve"> PAGEREF _Toc239669903 \h </w:instrText>
         </w:r>
         <w:r>
           <w:rPr>
@@ -716,7 +716,7 @@
           <w14:ligatures w14:val="standardContextual"/>
         </w:rPr>
       </w:pPr>
-      <w:hyperlink w:anchor="_Toc239624503" w:history="1">
+      <w:hyperlink w:anchor="_Toc239669904" w:history="1">
         <w:r>
           <w:rPr>
             <w:rStyle w:val="Hipervnculo"/>
@@ -744,7 +744,7 @@
             <w:noProof/>
             <w:webHidden/>
           </w:rPr>
-          <w:instrText xml:space="preserve"> PAGEREF _Toc239624503 \h </w:instrText>
+          <w:instrText xml:space="preserve"> PAGEREF _Toc239669904 \h </w:instrText>
         </w:r>
         <w:r>
           <w:rPr>
@@ -792,7 +792,7 @@
           <w14:ligatures w14:val="standardContextual"/>
         </w:rPr>
       </w:pPr>
-      <w:hyperlink w:anchor="_Toc239624504" w:history="1">
+      <w:hyperlink w:anchor="_Toc239669905" w:history="1">
         <w:r>
           <w:rPr>
             <w:rStyle w:val="Hipervnculo"/>
@@ -820,7 +820,7 @@
             <w:noProof/>
             <w:webHidden/>
           </w:rPr>
-          <w:instrText xml:space="preserve"> PAGEREF _Toc239624504 \h </w:instrText>
+          <w:instrText xml:space="preserve"> PAGEREF _Toc239669905 \h </w:instrText>
         </w:r>
         <w:r>
           <w:rPr>
@@ -869,7 +869,7 @@
           <w14:ligatures w14:val="standardContextual"/>
         </w:rPr>
       </w:pPr>
-      <w:hyperlink w:anchor="_Toc239624505" w:history="1">
+      <w:hyperlink w:anchor="_Toc239669906" w:history="1">
         <w:r>
           <w:rPr>
             <w:rStyle w:val="Hipervnculo"/>
@@ -921,7 +921,7 @@
             <w:noProof/>
             <w:webHidden/>
           </w:rPr>
-          <w:instrText xml:space="preserve"> PAGEREF _Toc239624505 \h </w:instrText>
+          <w:instrText xml:space="preserve"> PAGEREF _Toc239669906 \h </w:instrText>
         </w:r>
         <w:r>
           <w:rPr>
@@ -969,7 +969,7 @@
           <w14:ligatures w14:val="standardContextual"/>
         </w:rPr>
       </w:pPr>
-      <w:hyperlink w:anchor="_Toc239624506" w:history="1">
+      <w:hyperlink w:anchor="_Toc239669907" w:history="1">
         <w:r>
           <w:rPr>
             <w:rStyle w:val="Hipervnculo"/>
@@ -997,7 +997,7 @@
             <w:noProof/>
             <w:webHidden/>
           </w:rPr>
-          <w:instrText xml:space="preserve"> PAGEREF _Toc239624506 \h </w:instrText>
+          <w:instrText xml:space="preserve"> PAGEREF _Toc239669907 \h </w:instrText>
         </w:r>
         <w:r>
           <w:rPr>
@@ -1045,7 +1045,7 @@
           <w14:ligatures w14:val="standardContextual"/>
         </w:rPr>
       </w:pPr>
-      <w:hyperlink w:anchor="_Toc239624507" w:history="1">
+      <w:hyperlink w:anchor="_Toc239669908" w:history="1">
         <w:r>
           <w:rPr>
             <w:rStyle w:val="Hipervnculo"/>
@@ -1073,7 +1073,7 @@
             <w:noProof/>
             <w:webHidden/>
           </w:rPr>
-          <w:instrText xml:space="preserve"> PAGEREF _Toc239624507 \h </w:instrText>
+          <w:instrText xml:space="preserve"> PAGEREF _Toc239669908 \h </w:instrText>
         </w:r>
         <w:r>
           <w:rPr>
@@ -1121,7 +1121,7 @@
           <w14:ligatures w14:val="standardContextual"/>
         </w:rPr>
       </w:pPr>
-      <w:hyperlink w:anchor="_Toc239624508" w:history="1">
+      <w:hyperlink w:anchor="_Toc239669909" w:history="1">
         <w:r>
           <w:rPr>
             <w:rStyle w:val="Hipervnculo"/>
@@ -1149,7 +1149,7 @@
             <w:noProof/>
             <w:webHidden/>
           </w:rPr>
-          <w:instrText xml:space="preserve"> PAGEREF _Toc239624508 \h </w:instrText>
+          <w:instrText xml:space="preserve"> PAGEREF _Toc239669909 \h </w:instrText>
         </w:r>
         <w:r>
           <w:rPr>
@@ -1197,7 +1197,7 @@
           <w14:ligatures w14:val="standardContextual"/>
         </w:rPr>
       </w:pPr>
-      <w:hyperlink w:anchor="_Toc239624509" w:history="1">
+      <w:hyperlink w:anchor="_Toc239669910" w:history="1">
         <w:r>
           <w:rPr>
             <w:rStyle w:val="Hipervnculo"/>
@@ -1225,7 +1225,7 @@
             <w:noProof/>
             <w:webHidden/>
           </w:rPr>
-          <w:instrText xml:space="preserve"> PAGEREF _Toc239624509 \h </w:instrText>
+          <w:instrText xml:space="preserve"> PAGEREF _Toc239669910 \h </w:instrText>
         </w:r>
         <w:r>
           <w:rPr>
@@ -1273,7 +1273,7 @@
           <w14:ligatures w14:val="standardContextual"/>
         </w:rPr>
       </w:pPr>
-      <w:hyperlink w:anchor="_Toc239624510" w:history="1">
+      <w:hyperlink w:anchor="_Toc239669911" w:history="1">
         <w:r>
           <w:rPr>
             <w:rStyle w:val="Hipervnculo"/>
@@ -1301,83 +1301,7 @@
             <w:noProof/>
             <w:webHidden/>
           </w:rPr>
-          <w:instrText xml:space="preserve"> PAGEREF _Toc239624510 \h </w:instrText>
-        </w:r>
-        <w:r>
-          <w:rPr>
-            <w:noProof/>
-            <w:webHidden/>
-          </w:rPr>
-        </w:r>
-        <w:r>
-          <w:rPr>
-            <w:noProof/>
-            <w:webHidden/>
-          </w:rPr>
-          <w:fldChar w:fldCharType="separate"/>
-        </w:r>
-        <w:r>
-          <w:rPr>
-            <w:noProof/>
-            <w:webHidden/>
-          </w:rPr>
-          <w:t>13</w:t>
-        </w:r>
-        <w:r>
-          <w:rPr>
-            <w:noProof/>
-            <w:webHidden/>
-          </w:rPr>
-          <w:fldChar w:fldCharType="end"/>
-        </w:r>
-      </w:hyperlink>
-    </w:p>
-    <w:p>
-      <w:pPr>
-        <w:pStyle w:val="TDC1"/>
-        <w:tabs>
-          <w:tab w:val="right" w:leader="dot" w:pos="8494"/>
-        </w:tabs>
-        <w:rPr>
-          <w:rFonts w:asciiTheme="minorHAnsi" w:eastAsiaTheme="minorEastAsia" w:hAnsiTheme="minorHAnsi"/>
-          <w:noProof/>
-          <w:color w:val="auto"/>
-          <w:kern w:val="2"/>
-          <w:sz w:val="24"/>
-          <w:szCs w:val="24"/>
-          <w:lang w:eastAsia="es-CL"/>
-          <w14:ligatures w14:val="standardContextual"/>
-        </w:rPr>
-      </w:pPr>
-      <w:hyperlink w:anchor="_Toc239624511" w:history="1">
-        <w:r>
-          <w:rPr>
-            <w:rStyle w:val="Hipervnculo"/>
-            <w:b/>
-            <w:noProof/>
-          </w:rPr>
-          <w:t>Conclusiones individuales (English)</w:t>
-        </w:r>
-        <w:r>
-          <w:rPr>
-            <w:noProof/>
-            <w:webHidden/>
-          </w:rPr>
-          <w:tab/>
-        </w:r>
-        <w:r>
-          <w:rPr>
-            <w:noProof/>
-            <w:webHidden/>
-          </w:rPr>
-          <w:fldChar w:fldCharType="begin"/>
-        </w:r>
-        <w:r>
-          <w:rPr>
-            <w:noProof/>
-            <w:webHidden/>
-          </w:rPr>
-          <w:instrText xml:space="preserve"> PAGEREF _Toc239624511 \h </w:instrText>
+          <w:instrText xml:space="preserve"> PAGEREF _Toc239669911 \h </w:instrText>
         </w:r>
         <w:r>
           <w:rPr>
@@ -1425,14 +1349,14 @@
           <w14:ligatures w14:val="standardContextual"/>
         </w:rPr>
       </w:pPr>
-      <w:hyperlink w:anchor="_Toc239624512" w:history="1">
+      <w:hyperlink w:anchor="_Toc239669912" w:history="1">
         <w:r>
           <w:rPr>
             <w:rStyle w:val="Hipervnculo"/>
             <w:b/>
             <w:noProof/>
           </w:rPr>
-          <w:t>Reflexión (English)</w:t>
+          <w:t>Conclusiones individuales (English)</w:t>
         </w:r>
         <w:r>
           <w:rPr>
@@ -1453,7 +1377,7 @@
             <w:noProof/>
             <w:webHidden/>
           </w:rPr>
-          <w:instrText xml:space="preserve"> PAGEREF _Toc239624512 \h </w:instrText>
+          <w:instrText xml:space="preserve"> PAGEREF _Toc239669912 \h </w:instrText>
         </w:r>
         <w:r>
           <w:rPr>
@@ -1501,14 +1425,14 @@
           <w14:ligatures w14:val="standardContextual"/>
         </w:rPr>
       </w:pPr>
-      <w:hyperlink w:anchor="_Toc239624513" w:history="1">
+      <w:hyperlink w:anchor="_Toc239669913" w:history="1">
         <w:r>
           <w:rPr>
             <w:rStyle w:val="Hipervnculo"/>
             <w:b/>
             <w:noProof/>
           </w:rPr>
-          <w:t>Bibliografía</w:t>
+          <w:t>Reflexión (English)</w:t>
         </w:r>
         <w:r>
           <w:rPr>
@@ -1529,7 +1453,7 @@
             <w:noProof/>
             <w:webHidden/>
           </w:rPr>
-          <w:instrText xml:space="preserve"> PAGEREF _Toc239624513 \h </w:instrText>
+          <w:instrText xml:space="preserve"> PAGEREF _Toc239669913 \h </w:instrText>
         </w:r>
         <w:r>
           <w:rPr>
@@ -1577,7 +1501,83 @@
           <w14:ligatures w14:val="standardContextual"/>
         </w:rPr>
       </w:pPr>
-      <w:hyperlink w:anchor="_Toc239624514" w:history="1">
+      <w:hyperlink w:anchor="_Toc239669914" w:history="1">
+        <w:r>
+          <w:rPr>
+            <w:rStyle w:val="Hipervnculo"/>
+            <w:b/>
+            <w:noProof/>
+          </w:rPr>
+          <w:t>Bibliografía</w:t>
+        </w:r>
+        <w:r>
+          <w:rPr>
+            <w:noProof/>
+            <w:webHidden/>
+          </w:rPr>
+          <w:tab/>
+        </w:r>
+        <w:r>
+          <w:rPr>
+            <w:noProof/>
+            <w:webHidden/>
+          </w:rPr>
+          <w:fldChar w:fldCharType="begin"/>
+        </w:r>
+        <w:r>
+          <w:rPr>
+            <w:noProof/>
+            <w:webHidden/>
+          </w:rPr>
+          <w:instrText xml:space="preserve"> PAGEREF _Toc239669914 \h </w:instrText>
+        </w:r>
+        <w:r>
+          <w:rPr>
+            <w:noProof/>
+            <w:webHidden/>
+          </w:rPr>
+        </w:r>
+        <w:r>
+          <w:rPr>
+            <w:noProof/>
+            <w:webHidden/>
+          </w:rPr>
+          <w:fldChar w:fldCharType="separate"/>
+        </w:r>
+        <w:r>
+          <w:rPr>
+            <w:noProof/>
+            <w:webHidden/>
+          </w:rPr>
+          <w:t>15</w:t>
+        </w:r>
+        <w:r>
+          <w:rPr>
+            <w:noProof/>
+            <w:webHidden/>
+          </w:rPr>
+          <w:fldChar w:fldCharType="end"/>
+        </w:r>
+      </w:hyperlink>
+    </w:p>
+    <w:p>
+      <w:pPr>
+        <w:pStyle w:val="TDC1"/>
+        <w:tabs>
+          <w:tab w:val="right" w:leader="dot" w:pos="8494"/>
+        </w:tabs>
+        <w:rPr>
+          <w:rFonts w:asciiTheme="minorHAnsi" w:eastAsiaTheme="minorEastAsia" w:hAnsiTheme="minorHAnsi"/>
+          <w:noProof/>
+          <w:color w:val="auto"/>
+          <w:kern w:val="2"/>
+          <w:sz w:val="24"/>
+          <w:szCs w:val="24"/>
+          <w:lang w:eastAsia="es-CL"/>
+          <w14:ligatures w14:val="standardContextual"/>
+        </w:rPr>
+      </w:pPr>
+      <w:hyperlink w:anchor="_Toc239669915" w:history="1">
         <w:r>
           <w:rPr>
             <w:rStyle w:val="Hipervnculo"/>
@@ -1605,7 +1605,7 @@
             <w:noProof/>
             <w:webHidden/>
           </w:rPr>
-          <w:instrText xml:space="preserve"> PAGEREF _Toc239624514 \h </w:instrText>
+          <w:instrText xml:space="preserve"> PAGEREF _Toc239669915 \h </w:instrText>
         </w:r>
         <w:r>
           <w:rPr>
@@ -1653,7 +1653,7 @@
           <w14:ligatures w14:val="standardContextual"/>
         </w:rPr>
       </w:pPr>
-      <w:hyperlink w:anchor="_Toc239624515" w:history="1">
+      <w:hyperlink w:anchor="_Toc239669916" w:history="1">
         <w:r>
           <w:rPr>
             <w:rStyle w:val="Hipervnculo"/>
@@ -1681,7 +1681,7 @@
             <w:noProof/>
             <w:webHidden/>
           </w:rPr>
-          <w:instrText xml:space="preserve"> PAGEREF _Toc239624515 \h </w:instrText>
+          <w:instrText xml:space="preserve"> PAGEREF _Toc239669916 \h </w:instrText>
         </w:r>
         <w:r>
           <w:rPr>
@@ -1731,7 +1731,7 @@
         <w:spacing w:before="240" w:after="120" w:line="240" w:lineRule="auto"/>
         <w:outlineLvl w:val="0"/>
       </w:pPr>
-      <w:bookmarkStart w:id="1" w:name="_Toc239624498"/>
+      <w:bookmarkStart w:id="1" w:name="_Toc239669899"/>
       <w:r>
         <w:rPr>
           <w:b/>
@@ -1748,7 +1748,7 @@
         <w:spacing w:before="160" w:after="120" w:line="240" w:lineRule="auto"/>
         <w:outlineLvl w:val="1"/>
       </w:pPr>
-      <w:bookmarkStart w:id="2" w:name="_Toc239624499"/>
+      <w:bookmarkStart w:id="2" w:name="_Toc239669900"/>
       <w:r>
         <w:rPr>
           <w:b/>
@@ -1779,7 +1779,7 @@
         <w:spacing w:before="160" w:after="120" w:line="240" w:lineRule="auto"/>
         <w:outlineLvl w:val="1"/>
       </w:pPr>
-      <w:bookmarkStart w:id="3" w:name="_Toc239624500"/>
+      <w:bookmarkStart w:id="3" w:name="_Toc239669901"/>
       <w:r>
         <w:rPr>
           <w:b/>
@@ -1844,7 +1844,7 @@
           <w:szCs w:val="32"/>
         </w:rPr>
       </w:pPr>
-      <w:bookmarkStart w:id="4" w:name="_Toc239624501"/>
+      <w:bookmarkStart w:id="4" w:name="_Toc239669902"/>
       <w:r>
         <w:rPr>
           <w:b/>
@@ -1894,7 +1894,7 @@
                 <w:szCs w:val="28"/>
               </w:rPr>
             </w:pPr>
-            <w:bookmarkStart w:id="5" w:name="_Toc239624502"/>
+            <w:bookmarkStart w:id="5" w:name="_Toc239669903"/>
             <w:r>
               <w:rPr>
                 <w:b/>
@@ -2243,7 +2243,7 @@
                 <w:szCs w:val="28"/>
               </w:rPr>
             </w:pPr>
-            <w:bookmarkStart w:id="6" w:name="_Toc239624503"/>
+            <w:bookmarkStart w:id="6" w:name="_Toc239669904"/>
             <w:r>
               <w:rPr>
                 <w:b/>
@@ -2536,7 +2536,7 @@
                 <w:szCs w:val="28"/>
               </w:rPr>
             </w:pPr>
-            <w:bookmarkStart w:id="7" w:name="_Toc239624504"/>
+            <w:bookmarkStart w:id="7" w:name="_Toc239669905"/>
             <w:r>
               <w:rPr>
                 <w:b/>
@@ -3118,7 +3118,7 @@
               <w:t xml:space="preserve">Horas asignadas a la asignatura. </w:t>
             </w:r>
             <w:r>
-              <w:t>La asignatura tiene 20 créditos. La carga del líder técnico se sumó contra las once semanas de desarrollo antes de comprometer el alcance: el plan original exigía 290 horas con holgura, que no cabían. Con el alcance ajustado (dos clases de EPP, etiquetado compartido entre los tres integrantes y el modelo de lenguaje visual fuera del compromiso) la carga queda entre 10 y 15 horas semanales por integrante, compatible con el resto de la carga académica y laboral del equipo.</w:t>
+              <w:t>La carga del líder técnico se sumó contra las once semanas de desarrollo antes de comprometer el alcance: el plan original exigía 290 horas con holgura, que no cabían. Con el alcance ajustado (dos clases de EPP, etiquetado compartido entre los tres integrantes y el modelo de lenguaje visual fuera del compromiso) la carga del líder queda entre 12 y 15 horas semanales y la de los demás integrantes por debajo de esa cifra, compatible con el resto de la carga académica y laboral del equipo.</w:t>
             </w:r>
           </w:p>
           <w:p>
@@ -3206,7 +3206,7 @@
           <w:szCs w:val="32"/>
         </w:rPr>
       </w:pPr>
-      <w:bookmarkStart w:id="8" w:name="_Toc239624505"/>
+      <w:bookmarkStart w:id="8" w:name="_Toc239669906"/>
       <w:r>
         <w:rPr>
           <w:b/>
@@ -3266,7 +3266,7 @@
                 <w:szCs w:val="28"/>
               </w:rPr>
             </w:pPr>
-            <w:bookmarkStart w:id="9" w:name="_Toc239624506"/>
+            <w:bookmarkStart w:id="9" w:name="_Toc239669907"/>
             <w:r>
               <w:rPr>
                 <w:b/>
@@ -3592,7 +3592,7 @@
                 <w:szCs w:val="28"/>
               </w:rPr>
             </w:pPr>
-            <w:bookmarkStart w:id="10" w:name="_Toc239624507"/>
+            <w:bookmarkStart w:id="10" w:name="_Toc239669908"/>
             <w:r>
               <w:rPr>
                 <w:b/>
@@ -3885,7 +3885,7 @@
                 <w:szCs w:val="28"/>
               </w:rPr>
             </w:pPr>
-            <w:bookmarkStart w:id="11" w:name="_Toc239624508"/>
+            <w:bookmarkStart w:id="11" w:name="_Toc239669909"/>
             <w:r>
               <w:rPr>
                 <w:b/>
@@ -4993,7 +4993,7 @@
                 <w:szCs w:val="28"/>
               </w:rPr>
             </w:pPr>
-            <w:bookmarkStart w:id="12" w:name="_Toc239624509"/>
+            <w:bookmarkStart w:id="12" w:name="_Toc239669910"/>
             <w:r>
               <w:rPr>
                 <w:b/>
@@ -6342,7 +6342,7 @@
               <w:rPr>
                 <w:sz w:val="18"/>
               </w:rPr>
-              <w:t>Semanas 6 y 7</w:t>
+              <w:t>Semanas 4 a 7</w:t>
             </w:r>
           </w:p>
         </w:tc>
@@ -6394,7 +6394,7 @@
               <w:rPr>
                 <w:sz w:val="18"/>
               </w:rPr>
-              <w:t>Facilitador: diseño aprobado y contrato congelado.</w:t>
+              <w:t>Facilitador: diseño aprobado y contrato congelado; arranca en la S4 contra el servidor simulado.</w:t>
             </w:r>
           </w:p>
         </w:tc>
@@ -7511,7 +7511,7 @@
               <w:rPr>
                 <w:sz w:val="18"/>
               </w:rPr>
-              <w:t>C1 software · C2 datos</w:t>
+              <w:t>C3 pruebas</w:t>
             </w:r>
           </w:p>
         </w:tc>
@@ -7535,7 +7535,7 @@
               <w:rPr>
                 <w:sz w:val="18"/>
               </w:rPr>
-              <w:t>Analítica, reportes y administración</w:t>
+              <w:t>Segunda ronda del modelo</w:t>
             </w:r>
           </w:p>
         </w:tc>
@@ -7559,7 +7559,7 @@
               <w:rPr>
                 <w:sz w:val="18"/>
               </w:rPr>
-              <w:t>Consultas agregadas por EPP, zona, horario y tendencia; tablero y reportes.</w:t>
+              <w:t>Una ronda de corrección sobre los fallos del primer modelo (aprendizaje activo) y reevaluación con las mismas métricas.</w:t>
             </w:r>
           </w:p>
         </w:tc>
@@ -7583,7 +7583,7 @@
               <w:rPr>
                 <w:sz w:val="18"/>
               </w:rPr>
-              <w:t>PostgreSQL, React, librería de gráficos</w:t>
+              <w:t>GPU local, cómputo gratuito en la nube</w:t>
             </w:r>
           </w:p>
         </w:tc>
@@ -7610,7 +7610,7 @@
               <w:rPr>
                 <w:sz w:val="18"/>
               </w:rPr>
-              <w:t>Semanas 12 y 13</w:t>
+              <w:t>Semana 12</w:t>
             </w:r>
           </w:p>
         </w:tc>
@@ -7638,7 +7638,7 @@
               <w:rPr>
                 <w:sz w:val="18"/>
               </w:rPr>
-              <w:t>Liân y Edgar</w:t>
+              <w:t>Edgar</w:t>
             </w:r>
           </w:p>
         </w:tc>
@@ -7662,7 +7662,7 @@
               <w:rPr>
                 <w:sz w:val="18"/>
               </w:rPr>
-              <w:t>Supresión de celdas con menos de cinco personas al cruzar con dotación.</w:t>
+              <w:t>Reducida a una sola ronda por la verificación de horas (V9).</w:t>
             </w:r>
           </w:p>
         </w:tc>
@@ -7691,7 +7691,7 @@
               <w:rPr>
                 <w:sz w:val="18"/>
               </w:rPr>
-              <w:t>C1 software</w:t>
+              <w:t>C1 software · C2 datos</w:t>
             </w:r>
           </w:p>
         </w:tc>
@@ -7715,7 +7715,7 @@
               <w:rPr>
                 <w:sz w:val="18"/>
               </w:rPr>
-              <w:t>Extensión demostrada: descripción con modelo de lenguaje visual</w:t>
+              <w:t>Analítica, reportes y administración</w:t>
             </w:r>
           </w:p>
         </w:tc>
@@ -7739,7 +7739,7 @@
               <w:rPr>
                 <w:sz w:val="18"/>
               </w:rPr>
-              <w:t>Descripción textual selectiva de hallazgos. El modelo describe, nunca decide.</w:t>
+              <w:t>Consultas agregadas por EPP, zona, horario y tendencia; tablero y reportes.</w:t>
             </w:r>
           </w:p>
         </w:tc>
@@ -7763,7 +7763,7 @@
               <w:rPr>
                 <w:sz w:val="18"/>
               </w:rPr>
-              <w:t>GPU local</w:t>
+              <w:t>PostgreSQL, React, librería de gráficos</w:t>
             </w:r>
           </w:p>
         </w:tc>
@@ -7790,7 +7790,7 @@
               <w:rPr>
                 <w:sz w:val="18"/>
               </w:rPr>
-              <w:t>Semana 13 (solo si hay holgura)</w:t>
+              <w:t>Semanas 12 y 13</w:t>
             </w:r>
           </w:p>
         </w:tc>
@@ -7818,7 +7818,7 @@
               <w:rPr>
                 <w:sz w:val="18"/>
               </w:rPr>
-              <w:t>Edgar</w:t>
+              <w:t>Liân y Edgar</w:t>
             </w:r>
           </w:p>
         </w:tc>
@@ -7842,7 +7842,7 @@
               <w:rPr>
                 <w:sz w:val="18"/>
               </w:rPr>
-              <w:t>Fuera del alcance comprometido; se presenta como diseño si no alcanza el tiempo.</w:t>
+              <w:t>Supresión de celdas con menos de cinco personas al cruzar con dotación.</w:t>
             </w:r>
           </w:p>
         </w:tc>
@@ -7871,7 +7871,7 @@
               <w:rPr>
                 <w:sz w:val="18"/>
               </w:rPr>
-              <w:t>C3 pruebas</w:t>
+              <w:t>C1 software</w:t>
             </w:r>
           </w:p>
         </w:tc>
@@ -7895,7 +7895,7 @@
               <w:rPr>
                 <w:sz w:val="18"/>
               </w:rPr>
-              <w:t>Endurecimiento</w:t>
+              <w:t>Extensión demostrada: descripción con modelo de lenguaje visual</w:t>
             </w:r>
           </w:p>
         </w:tc>
@@ -7919,7 +7919,7 @@
               <w:rPr>
                 <w:sz w:val="18"/>
               </w:rPr>
-              <w:t>Plan de pruebas formal ejecutado, rendimiento, accesibilidad y manual técnico.</w:t>
+              <w:t>Descripción textual selectiva de hallazgos. El modelo describe, nunca decide.</w:t>
             </w:r>
           </w:p>
         </w:tc>
@@ -7943,7 +7943,7 @@
               <w:rPr>
                 <w:sz w:val="18"/>
               </w:rPr>
-              <w:t>Herramientas de prueba, video de referencia</w:t>
+              <w:t>GPU local</w:t>
             </w:r>
           </w:p>
         </w:tc>
@@ -7970,7 +7970,7 @@
               <w:rPr>
                 <w:sz w:val="18"/>
               </w:rPr>
-              <w:t>Semana 14</w:t>
+              <w:t>Semana 13 (solo si hay holgura)</w:t>
             </w:r>
           </w:p>
         </w:tc>
@@ -7998,7 +7998,7 @@
               <w:rPr>
                 <w:sz w:val="18"/>
               </w:rPr>
-              <w:t>Equipo</w:t>
+              <w:t>Edgar</w:t>
             </w:r>
           </w:p>
         </w:tc>
@@ -8022,7 +8022,7 @@
               <w:rPr>
                 <w:sz w:val="18"/>
               </w:rPr>
-              <w:t>Métricas de aceptación acordadas antes de medir.</w:t>
+              <w:t>Fuera del alcance comprometido; se presenta como diseño si no alcanza el tiempo.</w:t>
             </w:r>
           </w:p>
         </w:tc>
@@ -8051,7 +8051,7 @@
               <w:rPr>
                 <w:sz w:val="18"/>
               </w:rPr>
-              <w:t>C4 gestión · C1 software</w:t>
+              <w:t>C3 pruebas</w:t>
             </w:r>
           </w:p>
         </w:tc>
@@ -8075,7 +8075,7 @@
               <w:rPr>
                 <w:sz w:val="18"/>
               </w:rPr>
-              <w:t>Congelar v1.0.0, informe final y presentación</w:t>
+              <w:t>Endurecimiento</w:t>
             </w:r>
           </w:p>
         </w:tc>
@@ -8099,7 +8099,7 @@
               <w:rPr>
                 <w:sz w:val="18"/>
               </w:rPr>
-              <w:t>Etiqueta de versión, informe final (Guía 2.6) y presentación de la entrega.</w:t>
+              <w:t>Plan de pruebas formal ejecutado, rendimiento, accesibilidad y manual técnico.</w:t>
             </w:r>
           </w:p>
         </w:tc>
@@ -8123,7 +8123,7 @@
               <w:rPr>
                 <w:sz w:val="18"/>
               </w:rPr>
-              <w:t>Repositorio, Guía 2.6</w:t>
+              <w:t>Herramientas de prueba, video de referencia</w:t>
             </w:r>
           </w:p>
         </w:tc>
@@ -8150,7 +8150,7 @@
               <w:rPr>
                 <w:sz w:val="18"/>
               </w:rPr>
-              <w:t>Semana 15 (hito S15)</w:t>
+              <w:t>Semana 14</w:t>
             </w:r>
           </w:p>
         </w:tc>
@@ -8202,7 +8202,7 @@
               <w:rPr>
                 <w:sz w:val="18"/>
               </w:rPr>
-              <w:t>Entrega final de la Fase 2.</w:t>
+              <w:t>Métricas de aceptación acordadas antes de medir.</w:t>
             </w:r>
           </w:p>
         </w:tc>
@@ -8231,7 +8231,7 @@
               <w:rPr>
                 <w:sz w:val="18"/>
               </w:rPr>
-              <w:t>C4 gestión</w:t>
+              <w:t>C4 gestión · C1 software</w:t>
             </w:r>
           </w:p>
         </w:tc>
@@ -8255,7 +8255,7 @@
               <w:rPr>
                 <w:sz w:val="18"/>
               </w:rPr>
-              <w:t>Cierre y defensa</w:t>
+              <w:t>Congelar v1.0.0, informe final y presentación</w:t>
             </w:r>
           </w:p>
         </w:tc>
@@ -8279,7 +8279,7 @@
               <w:rPr>
                 <w:sz w:val="18"/>
               </w:rPr>
-              <w:t>Manual de usuario, documentos de cierre, ensayo y defensa final.</w:t>
+              <w:t>Etiqueta de versión, informe final (Guía 2.6) y presentación de la entrega.</w:t>
             </w:r>
           </w:p>
         </w:tc>
@@ -8303,6 +8303,194 @@
               <w:rPr>
                 <w:sz w:val="18"/>
               </w:rPr>
+              <w:t>Repositorio, Guía 2.6</w:t>
+            </w:r>
+          </w:p>
+        </w:tc>
+        <w:tc>
+          <w:tcPr>
+            <w:tcW w:w="1580" w:type="dxa"/>
+            <w:tcBorders>
+              <w:right w:val="single" w:sz="4" w:space="0" w:color="FFFFFF" w:themeColor="background1"/>
+            </w:tcBorders>
+          </w:tcPr>
+          <w:p>
+            <w:pPr>
+              <w:spacing w:after="80" w:line="240" w:lineRule="auto"/>
+              <w:rPr>
+                <w:rFonts w:cs="Arial"/>
+                <w:i/>
+                <w:color w:val="548DD4"/>
+                <w:sz w:val="18"/>
+                <w:szCs w:val="20"/>
+                <w:lang w:eastAsia="es-CL"/>
+              </w:rPr>
+            </w:pPr>
+            <w:r>
+              <w:rPr>
+                <w:sz w:val="18"/>
+              </w:rPr>
+              <w:t>Semana 15 (hito S15)</w:t>
+            </w:r>
+          </w:p>
+        </w:tc>
+        <w:tc>
+          <w:tcPr>
+            <w:tcW w:w="1580" w:type="dxa"/>
+            <w:tcBorders>
+              <w:left w:val="single" w:sz="4" w:space="0" w:color="FFFFFF" w:themeColor="background1"/>
+            </w:tcBorders>
+            <w:shd w:val="clear" w:color="auto" w:fill="D9D9D9" w:themeFill="background1" w:themeFillShade="D9"/>
+          </w:tcPr>
+          <w:p>
+            <w:pPr>
+              <w:spacing w:after="80" w:line="240" w:lineRule="auto"/>
+              <w:rPr>
+                <w:rFonts w:cs="Arial"/>
+                <w:i/>
+                <w:color w:val="548DD4"/>
+                <w:sz w:val="18"/>
+                <w:szCs w:val="20"/>
+                <w:lang w:eastAsia="es-CL"/>
+              </w:rPr>
+            </w:pPr>
+            <w:r>
+              <w:rPr>
+                <w:sz w:val="18"/>
+              </w:rPr>
+              <w:t>Equipo</w:t>
+            </w:r>
+          </w:p>
+        </w:tc>
+        <w:tc>
+          <w:tcPr>
+            <w:tcW w:w="1581" w:type="dxa"/>
+          </w:tcPr>
+          <w:p>
+            <w:pPr>
+              <w:spacing w:after="80" w:line="240" w:lineRule="auto"/>
+              <w:rPr>
+                <w:rFonts w:cs="Arial"/>
+                <w:i/>
+                <w:color w:val="548DD4"/>
+                <w:sz w:val="18"/>
+                <w:szCs w:val="20"/>
+                <w:lang w:eastAsia="es-CL"/>
+              </w:rPr>
+            </w:pPr>
+            <w:r>
+              <w:rPr>
+                <w:sz w:val="18"/>
+              </w:rPr>
+              <w:t>Entrega final de la Fase 2.</w:t>
+            </w:r>
+          </w:p>
+        </w:tc>
+      </w:tr>
+      <w:tr>
+        <w:trPr>
+          <w:jc w:val="center"/>
+        </w:trPr>
+        <w:tc>
+          <w:tcPr>
+            <w:tcW w:w="1580" w:type="dxa"/>
+          </w:tcPr>
+          <w:p>
+            <w:pPr>
+              <w:spacing w:after="80" w:line="240" w:lineRule="auto"/>
+              <w:rPr>
+                <w:rFonts w:cs="Arial"/>
+                <w:i/>
+                <w:color w:val="548DD4"/>
+                <w:sz w:val="18"/>
+                <w:szCs w:val="20"/>
+                <w:lang w:eastAsia="es-CL"/>
+              </w:rPr>
+            </w:pPr>
+            <w:r>
+              <w:rPr>
+                <w:sz w:val="18"/>
+              </w:rPr>
+              <w:t>C4 gestión</w:t>
+            </w:r>
+          </w:p>
+        </w:tc>
+        <w:tc>
+          <w:tcPr>
+            <w:tcW w:w="1580" w:type="dxa"/>
+          </w:tcPr>
+          <w:p>
+            <w:pPr>
+              <w:spacing w:after="80" w:line="240" w:lineRule="auto"/>
+              <w:rPr>
+                <w:rFonts w:cs="Arial"/>
+                <w:i/>
+                <w:color w:val="548DD4"/>
+                <w:sz w:val="18"/>
+                <w:szCs w:val="20"/>
+                <w:lang w:eastAsia="es-CL"/>
+              </w:rPr>
+            </w:pPr>
+            <w:r>
+              <w:rPr>
+                <w:sz w:val="18"/>
+              </w:rPr>
+              <w:t>Cierre y defensa</w:t>
+            </w:r>
+          </w:p>
+        </w:tc>
+        <w:tc>
+          <w:tcPr>
+            <w:tcW w:w="1580" w:type="dxa"/>
+          </w:tcPr>
+          <w:p>
+            <w:pPr>
+              <w:spacing w:after="80" w:line="240" w:lineRule="auto"/>
+              <w:rPr>
+                <w:rFonts w:cs="Arial"/>
+                <w:i/>
+                <w:color w:val="548DD4"/>
+                <w:sz w:val="18"/>
+                <w:szCs w:val="20"/>
+                <w:lang w:eastAsia="es-CL"/>
+              </w:rPr>
+            </w:pPr>
+            <w:r>
+              <w:rPr>
+                <w:sz w:val="18"/>
+              </w:rPr>
+              <w:t xml:space="preserve">Manual de usuario, </w:t>
+            </w:r>
+            <w:r>
+              <w:rPr>
+                <w:sz w:val="18"/>
+              </w:rPr>
+              <w:lastRenderedPageBreak/>
+              <w:t>documentos de cierre, ensayo y defensa final.</w:t>
+            </w:r>
+          </w:p>
+        </w:tc>
+        <w:tc>
+          <w:tcPr>
+            <w:tcW w:w="1580" w:type="dxa"/>
+          </w:tcPr>
+          <w:p>
+            <w:pPr>
+              <w:spacing w:after="80" w:line="240" w:lineRule="auto"/>
+              <w:rPr>
+                <w:rFonts w:cs="Arial"/>
+                <w:i/>
+                <w:color w:val="548DD4"/>
+                <w:sz w:val="18"/>
+                <w:szCs w:val="20"/>
+                <w:lang w:eastAsia="es-CL"/>
+              </w:rPr>
+            </w:pPr>
+            <w:r>
+              <w:rPr>
+                <w:sz w:val="18"/>
+              </w:rPr>
+              <w:lastRenderedPageBreak/>
               <w:t>Presentación final</w:t>
             </w:r>
           </w:p>
@@ -8436,7 +8624,7 @@
                 <w:szCs w:val="28"/>
               </w:rPr>
             </w:pPr>
-            <w:bookmarkStart w:id="13" w:name="_Toc239624510"/>
+            <w:bookmarkStart w:id="13" w:name="_Toc239669911"/>
             <w:r>
               <w:rPr>
                 <w:b/>
@@ -8499,7 +8687,6 @@
               <w:rPr>
                 <w:color w:val="1F3864" w:themeColor="accent1" w:themeShade="80"/>
               </w:rPr>
-              <w:lastRenderedPageBreak/>
               <w:t xml:space="preserve">Busca un formato de Carta Gantt que te acomode y organiza en </w:t>
             </w:r>
             <w:r>
@@ -11107,6 +11294,7 @@
         <w:tc>
           <w:tcPr>
             <w:tcW w:w="523" w:type="dxa"/>
+            <w:shd w:val="clear" w:color="auto" w:fill="8C8C8C"/>
           </w:tcPr>
           <w:p>
             <w:pPr>
@@ -13191,12 +13379,13 @@
         <w:spacing w:before="240" w:after="120" w:line="240" w:lineRule="auto"/>
         <w:outlineLvl w:val="0"/>
       </w:pPr>
-      <w:bookmarkStart w:id="14" w:name="_Toc239624511"/>
+      <w:bookmarkStart w:id="14" w:name="_Toc239669912"/>
       <w:r>
         <w:rPr>
           <w:b/>
           <w:sz w:val="28"/>
         </w:rPr>
+        <w:lastRenderedPageBreak/>
         <w:t>Conclusiones individuales (English)</w:t>
       </w:r>
       <w:bookmarkEnd w:id="14"/>
@@ -13237,11 +13426,7 @@
         <w:t>[[Miguel: adjust in your own words]]</w:t>
       </w:r>
       <w:r>
-        <w:t xml:space="preserve"> During this phase I learned that a frontend can start before the backend exists when the API contract is frozen and a mock server is </w:t>
-      </w:r>
-      <w:r>
-        <w:lastRenderedPageBreak/>
-        <w:t>available. Working from an approved design with extracted tokens lets me focus on building reusable, accessible components instead of guessing what the data will look like. My goal for Phase 2 is to deliver the findings inbox and the evidence viewer early enough to test them with real events by week 9.</w:t>
+        <w:t xml:space="preserve"> During this phase I learned that a frontend can start before the backend exists when the API contract is frozen and a mock server is available. Working from an approved design with extracted tokens lets me focus on building reusable, accessible components instead of guessing what the data will look like. My goal for Phase 2 is to deliver the findings inbox and the evidence viewer early enough to test them with real events by week 9.</w:t>
       </w:r>
     </w:p>
     <w:p>
@@ -13284,7 +13469,7 @@
         <w:spacing w:before="240" w:after="120" w:line="240" w:lineRule="auto"/>
         <w:outlineLvl w:val="0"/>
       </w:pPr>
-      <w:bookmarkStart w:id="15" w:name="_Toc239624512"/>
+      <w:bookmarkStart w:id="15" w:name="_Toc239669913"/>
       <w:r>
         <w:rPr>
           <w:b/>
@@ -13312,7 +13497,7 @@
         <w:spacing w:before="240" w:after="120" w:line="240" w:lineRule="auto"/>
         <w:outlineLvl w:val="0"/>
       </w:pPr>
-      <w:bookmarkStart w:id="16" w:name="_Toc239624513"/>
+      <w:bookmarkStart w:id="16" w:name="_Toc239669914"/>
       <w:r>
         <w:rPr>
           <w:b/>
@@ -13364,6 +13549,7 @@
         <w:ind w:left="567" w:hanging="567"/>
       </w:pPr>
       <w:r>
+        <w:lastRenderedPageBreak/>
         <w:t>Carion, N., Massa, F., Synnaeve, G., Usunier, N., Kirillov, A., &amp; Zagoruyko, S. (2020). End-to-end object detection with transformers. En European Conference on Computer Vision (ECCV 2020). Springer.</w:t>
       </w:r>
     </w:p>
@@ -13409,13 +13595,12 @@
         <w:spacing w:before="240" w:after="120" w:line="240" w:lineRule="auto"/>
         <w:outlineLvl w:val="0"/>
       </w:pPr>
-      <w:bookmarkStart w:id="17" w:name="_Toc239624514"/>
+      <w:bookmarkStart w:id="17" w:name="_Toc239669915"/>
       <w:r>
         <w:rPr>
           <w:b/>
           <w:sz w:val="28"/>
         </w:rPr>
-        <w:lastRenderedPageBreak/>
         <w:t>Anexo A. Indicadores de calidad y dónde se evidencian</w:t>
       </w:r>
       <w:bookmarkEnd w:id="17"/>
@@ -13581,7 +13766,7 @@
               <w:rPr>
                 <w:sz w:val="20"/>
               </w:rPr>
-              <w:t>Modelo v2 por aprendizaje activo sobre los fallos del v1 (semana 12); revisión del plan en la semana 6 con el primer lote medido.</w:t>
+              <w:t>Segunda ronda del modelo, corrigiendo sobre los fallos del primero (semana 12); revisión del plan en la semana 6 con el primer lote medido.</w:t>
             </w:r>
           </w:p>
         </w:tc>
@@ -13838,7 +14023,7 @@
         <w:spacing w:before="240" w:after="120" w:line="240" w:lineRule="auto"/>
         <w:outlineLvl w:val="0"/>
       </w:pPr>
-      <w:bookmarkStart w:id="18" w:name="_Toc239624515"/>
+      <w:bookmarkStart w:id="18" w:name="_Toc239669916"/>
       <w:r>
         <w:rPr>
           <w:b/>
@@ -13863,6 +14048,7 @@
         <w:ind w:left="283" w:hanging="227"/>
       </w:pPr>
       <w:r>
+        <w:lastRenderedPageBreak/>
         <w:t>• Arquitectura y registros de decisión: docs/arquitectura/ (ADR 001 a 011)</w:t>
       </w:r>
     </w:p>
@@ -14638,16 +14824,16 @@
       </w:pPr>
     </w:lvl>
   </w:abstractNum>
-  <w:num w:numId="1" w16cid:durableId="1803495970">
+  <w:num w:numId="1" w16cid:durableId="1609311579">
     <w:abstractNumId w:val="2"/>
   </w:num>
-  <w:num w:numId="2" w16cid:durableId="1553812563">
+  <w:num w:numId="2" w16cid:durableId="1553544336">
     <w:abstractNumId w:val="3"/>
   </w:num>
-  <w:num w:numId="3" w16cid:durableId="1835145844">
+  <w:num w:numId="3" w16cid:durableId="95635240">
     <w:abstractNumId w:val="0"/>
   </w:num>
-  <w:num w:numId="4" w16cid:durableId="2062707770">
+  <w:num w:numId="4" w16cid:durableId="1150634071">
     <w:abstractNumId w:val="1"/>
   </w:num>
 </w:numbering>
@@ -15375,7 +15561,7 @@
     <w:autoRedefine/>
     <w:uiPriority w:val="39"/>
     <w:unhideWhenUsed/>
-    <w:rsid w:val="002102E2"/>
+    <w:rsid w:val="0005290E"/>
     <w:pPr>
       <w:spacing w:after="100"/>
     </w:pPr>
@@ -15387,7 +15573,7 @@
     <w:autoRedefine/>
     <w:uiPriority w:val="39"/>
     <w:unhideWhenUsed/>
-    <w:rsid w:val="002102E2"/>
+    <w:rsid w:val="0005290E"/>
     <w:pPr>
       <w:spacing w:after="100"/>
       <w:ind w:left="220"/>
@@ -15398,7 +15584,7 @@
     <w:basedOn w:val="Fuentedeprrafopredeter"/>
     <w:uiPriority w:val="99"/>
     <w:unhideWhenUsed/>
-    <w:rsid w:val="002102E2"/>
+    <w:rsid w:val="0005290E"/>
     <w:rPr>
       <w:color w:val="0563C1" w:themeColor="hyperlink"/>
       <w:u w:val="single"/>

</xml_diff>

<commit_message>
Completar datos de sede, docente y apellido de Lian en la Guía 1.5 y la presentación
- Sede: Padre Alonso Ovalle · Docente: Felix Eduardo Cifuentes Cid
- Lian Grandón en antecedentes, intereses, conclusiones, plan, bibliografía y láminas 1 y 2
- Los RUT siguen como marcador [[RUT]]: no entran al repositorio
- Quedan los marcadores de los párrafos que Miguel y Lian deben escribir con sus palabras
- Índice actualizado; 17 páginas

Co-Authored-By: Claude Fable 5.1 <noreply@anthropic.com>
Claude-Session: https://claude.ai/code/session_01Rvh88dkfXqgVzQiFw1YokL
</commit_message>
<xml_diff>
--- a/Fase 1/Evidencias Grupales/1.5_GuiaEstudiante_Fase 1_Definicion Proyecto APT.docx
+++ b/Fase 1/Evidencias Grupales/1.5_GuiaEstudiante_Fase 1_Definicion Proyecto APT.docx
@@ -124,13 +124,7 @@
         <w:jc w:val="center"/>
       </w:pPr>
       <w:r>
-        <w:t xml:space="preserve">Liân </w:t>
-      </w:r>
-      <w:r>
-        <w:rPr>
-          <w:highlight w:val="yellow"/>
-        </w:rPr>
-        <w:t>[[Apellido]]</w:t>
+        <w:t>Lian Grandón</w:t>
       </w:r>
     </w:p>
     <w:p>
@@ -154,13 +148,7 @@
         <w:jc w:val="center"/>
       </w:pPr>
       <w:r>
-        <w:t xml:space="preserve">Docente: </w:t>
-      </w:r>
-      <w:r>
-        <w:rPr>
-          <w:highlight w:val="yellow"/>
-        </w:rPr>
-        <w:t>[[Docente]]</w:t>
+        <w:t>Docente: Felix Eduardo Cifuentes Cid</w:t>
       </w:r>
     </w:p>
     <w:p>
@@ -169,13 +157,7 @@
         <w:jc w:val="center"/>
       </w:pPr>
       <w:r>
-        <w:t xml:space="preserve">Sede: </w:t>
-      </w:r>
-      <w:r>
-        <w:rPr>
-          <w:highlight w:val="yellow"/>
-        </w:rPr>
-        <w:t>[[Sede]]</w:t>
+        <w:t>Sede: Padre Alonso Ovalle</w:t>
       </w:r>
     </w:p>
     <w:p>
@@ -198,7 +180,7 @@
         <w:spacing w:before="240" w:after="120" w:line="240" w:lineRule="auto"/>
         <w:outlineLvl w:val="0"/>
       </w:pPr>
-      <w:bookmarkStart w:id="0" w:name="_Toc239669898"/>
+      <w:bookmarkStart w:id="0" w:name="_Toc239713406"/>
       <w:r>
         <w:rPr>
           <w:b/>
@@ -235,7 +217,7 @@
       <w:r>
         <w:fldChar w:fldCharType="separate"/>
       </w:r>
-      <w:hyperlink w:anchor="_Toc239669898" w:history="1">
+      <w:hyperlink w:anchor="_Toc239713406" w:history="1">
         <w:r>
           <w:rPr>
             <w:rStyle w:val="Hipervnculo"/>
@@ -263,7 +245,7 @@
             <w:noProof/>
             <w:webHidden/>
           </w:rPr>
-          <w:instrText xml:space="preserve"> PAGEREF _Toc239669898 \h </w:instrText>
+          <w:instrText xml:space="preserve"> PAGEREF _Toc239713406 \h </w:instrText>
         </w:r>
         <w:r>
           <w:rPr>
@@ -311,7 +293,7 @@
           <w14:ligatures w14:val="standardContextual"/>
         </w:rPr>
       </w:pPr>
-      <w:hyperlink w:anchor="_Toc239669899" w:history="1">
+      <w:hyperlink w:anchor="_Toc239713407" w:history="1">
         <w:r>
           <w:rPr>
             <w:rStyle w:val="Hipervnculo"/>
@@ -339,7 +321,7 @@
             <w:noProof/>
             <w:webHidden/>
           </w:rPr>
-          <w:instrText xml:space="preserve"> PAGEREF _Toc239669899 \h </w:instrText>
+          <w:instrText xml:space="preserve"> PAGEREF _Toc239713407 \h </w:instrText>
         </w:r>
         <w:r>
           <w:rPr>
@@ -387,7 +369,7 @@
           <w14:ligatures w14:val="standardContextual"/>
         </w:rPr>
       </w:pPr>
-      <w:hyperlink w:anchor="_Toc239669900" w:history="1">
+      <w:hyperlink w:anchor="_Toc239713408" w:history="1">
         <w:r>
           <w:rPr>
             <w:rStyle w:val="Hipervnculo"/>
@@ -415,7 +397,7 @@
             <w:noProof/>
             <w:webHidden/>
           </w:rPr>
-          <w:instrText xml:space="preserve"> PAGEREF _Toc239669900 \h </w:instrText>
+          <w:instrText xml:space="preserve"> PAGEREF _Toc239713408 \h </w:instrText>
         </w:r>
         <w:r>
           <w:rPr>
@@ -463,7 +445,7 @@
           <w14:ligatures w14:val="standardContextual"/>
         </w:rPr>
       </w:pPr>
-      <w:hyperlink w:anchor="_Toc239669901" w:history="1">
+      <w:hyperlink w:anchor="_Toc239713409" w:history="1">
         <w:r>
           <w:rPr>
             <w:rStyle w:val="Hipervnculo"/>
@@ -491,7 +473,7 @@
             <w:noProof/>
             <w:webHidden/>
           </w:rPr>
-          <w:instrText xml:space="preserve"> PAGEREF _Toc239669901 \h </w:instrText>
+          <w:instrText xml:space="preserve"> PAGEREF _Toc239713409 \h </w:instrText>
         </w:r>
         <w:r>
           <w:rPr>
@@ -540,7 +522,7 @@
           <w14:ligatures w14:val="standardContextual"/>
         </w:rPr>
       </w:pPr>
-      <w:hyperlink w:anchor="_Toc239669902" w:history="1">
+      <w:hyperlink w:anchor="_Toc239713410" w:history="1">
         <w:r>
           <w:rPr>
             <w:rStyle w:val="Hipervnculo"/>
@@ -592,7 +574,7 @@
             <w:noProof/>
             <w:webHidden/>
           </w:rPr>
-          <w:instrText xml:space="preserve"> PAGEREF _Toc239669902 \h </w:instrText>
+          <w:instrText xml:space="preserve"> PAGEREF _Toc239713410 \h </w:instrText>
         </w:r>
         <w:r>
           <w:rPr>
@@ -640,7 +622,7 @@
           <w14:ligatures w14:val="standardContextual"/>
         </w:rPr>
       </w:pPr>
-      <w:hyperlink w:anchor="_Toc239669903" w:history="1">
+      <w:hyperlink w:anchor="_Toc239713411" w:history="1">
         <w:r>
           <w:rPr>
             <w:rStyle w:val="Hipervnculo"/>
@@ -668,7 +650,7 @@
             <w:noProof/>
             <w:webHidden/>
           </w:rPr>
-          <w:instrText xml:space="preserve"> PAGEREF _Toc239669903 \h </w:instrText>
+          <w:instrText xml:space="preserve"> PAGEREF _Toc239713411 \h </w:instrText>
         </w:r>
         <w:r>
           <w:rPr>
@@ -716,7 +698,7 @@
           <w14:ligatures w14:val="standardContextual"/>
         </w:rPr>
       </w:pPr>
-      <w:hyperlink w:anchor="_Toc239669904" w:history="1">
+      <w:hyperlink w:anchor="_Toc239713412" w:history="1">
         <w:r>
           <w:rPr>
             <w:rStyle w:val="Hipervnculo"/>
@@ -744,7 +726,7 @@
             <w:noProof/>
             <w:webHidden/>
           </w:rPr>
-          <w:instrText xml:space="preserve"> PAGEREF _Toc239669904 \h </w:instrText>
+          <w:instrText xml:space="preserve"> PAGEREF _Toc239713412 \h </w:instrText>
         </w:r>
         <w:r>
           <w:rPr>
@@ -792,7 +774,7 @@
           <w14:ligatures w14:val="standardContextual"/>
         </w:rPr>
       </w:pPr>
-      <w:hyperlink w:anchor="_Toc239669905" w:history="1">
+      <w:hyperlink w:anchor="_Toc239713413" w:history="1">
         <w:r>
           <w:rPr>
             <w:rStyle w:val="Hipervnculo"/>
@@ -820,7 +802,7 @@
             <w:noProof/>
             <w:webHidden/>
           </w:rPr>
-          <w:instrText xml:space="preserve"> PAGEREF _Toc239669905 \h </w:instrText>
+          <w:instrText xml:space="preserve"> PAGEREF _Toc239713413 \h </w:instrText>
         </w:r>
         <w:r>
           <w:rPr>
@@ -869,7 +851,7 @@
           <w14:ligatures w14:val="standardContextual"/>
         </w:rPr>
       </w:pPr>
-      <w:hyperlink w:anchor="_Toc239669906" w:history="1">
+      <w:hyperlink w:anchor="_Toc239713414" w:history="1">
         <w:r>
           <w:rPr>
             <w:rStyle w:val="Hipervnculo"/>
@@ -921,7 +903,7 @@
             <w:noProof/>
             <w:webHidden/>
           </w:rPr>
-          <w:instrText xml:space="preserve"> PAGEREF _Toc239669906 \h </w:instrText>
+          <w:instrText xml:space="preserve"> PAGEREF _Toc239713414 \h </w:instrText>
         </w:r>
         <w:r>
           <w:rPr>
@@ -969,7 +951,7 @@
           <w14:ligatures w14:val="standardContextual"/>
         </w:rPr>
       </w:pPr>
-      <w:hyperlink w:anchor="_Toc239669907" w:history="1">
+      <w:hyperlink w:anchor="_Toc239713415" w:history="1">
         <w:r>
           <w:rPr>
             <w:rStyle w:val="Hipervnculo"/>
@@ -997,7 +979,7 @@
             <w:noProof/>
             <w:webHidden/>
           </w:rPr>
-          <w:instrText xml:space="preserve"> PAGEREF _Toc239669907 \h </w:instrText>
+          <w:instrText xml:space="preserve"> PAGEREF _Toc239713415 \h </w:instrText>
         </w:r>
         <w:r>
           <w:rPr>
@@ -1045,7 +1027,7 @@
           <w14:ligatures w14:val="standardContextual"/>
         </w:rPr>
       </w:pPr>
-      <w:hyperlink w:anchor="_Toc239669908" w:history="1">
+      <w:hyperlink w:anchor="_Toc239713416" w:history="1">
         <w:r>
           <w:rPr>
             <w:rStyle w:val="Hipervnculo"/>
@@ -1073,7 +1055,7 @@
             <w:noProof/>
             <w:webHidden/>
           </w:rPr>
-          <w:instrText xml:space="preserve"> PAGEREF _Toc239669908 \h </w:instrText>
+          <w:instrText xml:space="preserve"> PAGEREF _Toc239713416 \h </w:instrText>
         </w:r>
         <w:r>
           <w:rPr>
@@ -1121,7 +1103,7 @@
           <w14:ligatures w14:val="standardContextual"/>
         </w:rPr>
       </w:pPr>
-      <w:hyperlink w:anchor="_Toc239669909" w:history="1">
+      <w:hyperlink w:anchor="_Toc239713417" w:history="1">
         <w:r>
           <w:rPr>
             <w:rStyle w:val="Hipervnculo"/>
@@ -1149,7 +1131,7 @@
             <w:noProof/>
             <w:webHidden/>
           </w:rPr>
-          <w:instrText xml:space="preserve"> PAGEREF _Toc239669909 \h </w:instrText>
+          <w:instrText xml:space="preserve"> PAGEREF _Toc239713417 \h </w:instrText>
         </w:r>
         <w:r>
           <w:rPr>
@@ -1197,7 +1179,7 @@
           <w14:ligatures w14:val="standardContextual"/>
         </w:rPr>
       </w:pPr>
-      <w:hyperlink w:anchor="_Toc239669910" w:history="1">
+      <w:hyperlink w:anchor="_Toc239713418" w:history="1">
         <w:r>
           <w:rPr>
             <w:rStyle w:val="Hipervnculo"/>
@@ -1225,7 +1207,7 @@
             <w:noProof/>
             <w:webHidden/>
           </w:rPr>
-          <w:instrText xml:space="preserve"> PAGEREF _Toc239669910 \h </w:instrText>
+          <w:instrText xml:space="preserve"> PAGEREF _Toc239713418 \h </w:instrText>
         </w:r>
         <w:r>
           <w:rPr>
@@ -1273,7 +1255,7 @@
           <w14:ligatures w14:val="standardContextual"/>
         </w:rPr>
       </w:pPr>
-      <w:hyperlink w:anchor="_Toc239669911" w:history="1">
+      <w:hyperlink w:anchor="_Toc239713419" w:history="1">
         <w:r>
           <w:rPr>
             <w:rStyle w:val="Hipervnculo"/>
@@ -1301,7 +1283,7 @@
             <w:noProof/>
             <w:webHidden/>
           </w:rPr>
-          <w:instrText xml:space="preserve"> PAGEREF _Toc239669911 \h </w:instrText>
+          <w:instrText xml:space="preserve"> PAGEREF _Toc239713419 \h </w:instrText>
         </w:r>
         <w:r>
           <w:rPr>
@@ -1349,7 +1331,7 @@
           <w14:ligatures w14:val="standardContextual"/>
         </w:rPr>
       </w:pPr>
-      <w:hyperlink w:anchor="_Toc239669912" w:history="1">
+      <w:hyperlink w:anchor="_Toc239713420" w:history="1">
         <w:r>
           <w:rPr>
             <w:rStyle w:val="Hipervnculo"/>
@@ -1377,7 +1359,7 @@
             <w:noProof/>
             <w:webHidden/>
           </w:rPr>
-          <w:instrText xml:space="preserve"> PAGEREF _Toc239669912 \h </w:instrText>
+          <w:instrText xml:space="preserve"> PAGEREF _Toc239713420 \h </w:instrText>
         </w:r>
         <w:r>
           <w:rPr>
@@ -1425,7 +1407,7 @@
           <w14:ligatures w14:val="standardContextual"/>
         </w:rPr>
       </w:pPr>
-      <w:hyperlink w:anchor="_Toc239669913" w:history="1">
+      <w:hyperlink w:anchor="_Toc239713421" w:history="1">
         <w:r>
           <w:rPr>
             <w:rStyle w:val="Hipervnculo"/>
@@ -1453,7 +1435,7 @@
             <w:noProof/>
             <w:webHidden/>
           </w:rPr>
-          <w:instrText xml:space="preserve"> PAGEREF _Toc239669913 \h </w:instrText>
+          <w:instrText xml:space="preserve"> PAGEREF _Toc239713421 \h </w:instrText>
         </w:r>
         <w:r>
           <w:rPr>
@@ -1501,7 +1483,7 @@
           <w14:ligatures w14:val="standardContextual"/>
         </w:rPr>
       </w:pPr>
-      <w:hyperlink w:anchor="_Toc239669914" w:history="1">
+      <w:hyperlink w:anchor="_Toc239713422" w:history="1">
         <w:r>
           <w:rPr>
             <w:rStyle w:val="Hipervnculo"/>
@@ -1529,7 +1511,7 @@
             <w:noProof/>
             <w:webHidden/>
           </w:rPr>
-          <w:instrText xml:space="preserve"> PAGEREF _Toc239669914 \h </w:instrText>
+          <w:instrText xml:space="preserve"> PAGEREF _Toc239713422 \h </w:instrText>
         </w:r>
         <w:r>
           <w:rPr>
@@ -1577,7 +1559,7 @@
           <w14:ligatures w14:val="standardContextual"/>
         </w:rPr>
       </w:pPr>
-      <w:hyperlink w:anchor="_Toc239669915" w:history="1">
+      <w:hyperlink w:anchor="_Toc239713423" w:history="1">
         <w:r>
           <w:rPr>
             <w:rStyle w:val="Hipervnculo"/>
@@ -1605,7 +1587,7 @@
             <w:noProof/>
             <w:webHidden/>
           </w:rPr>
-          <w:instrText xml:space="preserve"> PAGEREF _Toc239669915 \h </w:instrText>
+          <w:instrText xml:space="preserve"> PAGEREF _Toc239713423 \h </w:instrText>
         </w:r>
         <w:r>
           <w:rPr>
@@ -1653,7 +1635,7 @@
           <w14:ligatures w14:val="standardContextual"/>
         </w:rPr>
       </w:pPr>
-      <w:hyperlink w:anchor="_Toc239669916" w:history="1">
+      <w:hyperlink w:anchor="_Toc239713424" w:history="1">
         <w:r>
           <w:rPr>
             <w:rStyle w:val="Hipervnculo"/>
@@ -1681,7 +1663,7 @@
             <w:noProof/>
             <w:webHidden/>
           </w:rPr>
-          <w:instrText xml:space="preserve"> PAGEREF _Toc239669916 \h </w:instrText>
+          <w:instrText xml:space="preserve"> PAGEREF _Toc239713424 \h </w:instrText>
         </w:r>
         <w:r>
           <w:rPr>
@@ -1731,7 +1713,7 @@
         <w:spacing w:before="240" w:after="120" w:line="240" w:lineRule="auto"/>
         <w:outlineLvl w:val="0"/>
       </w:pPr>
-      <w:bookmarkStart w:id="1" w:name="_Toc239669899"/>
+      <w:bookmarkStart w:id="1" w:name="_Toc239713407"/>
       <w:r>
         <w:rPr>
           <w:b/>
@@ -1748,7 +1730,7 @@
         <w:spacing w:before="160" w:after="120" w:line="240" w:lineRule="auto"/>
         <w:outlineLvl w:val="1"/>
       </w:pPr>
-      <w:bookmarkStart w:id="2" w:name="_Toc239669900"/>
+      <w:bookmarkStart w:id="2" w:name="_Toc239713408"/>
       <w:r>
         <w:rPr>
           <w:b/>
@@ -1779,7 +1761,7 @@
         <w:spacing w:before="160" w:after="120" w:line="240" w:lineRule="auto"/>
         <w:outlineLvl w:val="1"/>
       </w:pPr>
-      <w:bookmarkStart w:id="3" w:name="_Toc239669901"/>
+      <w:bookmarkStart w:id="3" w:name="_Toc239713409"/>
       <w:r>
         <w:rPr>
           <w:b/>
@@ -1844,7 +1826,7 @@
           <w:szCs w:val="32"/>
         </w:rPr>
       </w:pPr>
-      <w:bookmarkStart w:id="4" w:name="_Toc239669902"/>
+      <w:bookmarkStart w:id="4" w:name="_Toc239713410"/>
       <w:r>
         <w:rPr>
           <w:b/>
@@ -1894,7 +1876,7 @@
                 <w:szCs w:val="28"/>
               </w:rPr>
             </w:pPr>
-            <w:bookmarkStart w:id="5" w:name="_Toc239669903"/>
+            <w:bookmarkStart w:id="5" w:name="_Toc239713411"/>
             <w:r>
               <w:rPr>
                 <w:b/>
@@ -2032,13 +2014,7 @@
               <w:spacing w:after="80" w:line="240" w:lineRule="auto"/>
             </w:pPr>
             <w:r>
-              <w:t xml:space="preserve">Liân </w:t>
-            </w:r>
-            <w:r>
-              <w:rPr>
-                <w:highlight w:val="yellow"/>
-              </w:rPr>
-              <w:t>[[Apellido]]</w:t>
+              <w:t>Lian Grandón</w:t>
             </w:r>
           </w:p>
         </w:tc>
@@ -2186,10 +2162,7 @@
               </w:rPr>
             </w:pPr>
             <w:r>
-              <w:rPr>
-                <w:highlight w:val="yellow"/>
-              </w:rPr>
-              <w:t>[[Sede]]</w:t>
+              <w:t>Padre Alonso Ovalle</w:t>
             </w:r>
           </w:p>
         </w:tc>
@@ -2243,7 +2216,7 @@
                 <w:szCs w:val="28"/>
               </w:rPr>
             </w:pPr>
-            <w:bookmarkStart w:id="6" w:name="_Toc239669904"/>
+            <w:bookmarkStart w:id="6" w:name="_Toc239713412"/>
             <w:r>
               <w:rPr>
                 <w:b/>
@@ -2536,7 +2509,7 @@
                 <w:szCs w:val="28"/>
               </w:rPr>
             </w:pPr>
-            <w:bookmarkStart w:id="7" w:name="_Toc239669905"/>
+            <w:bookmarkStart w:id="7" w:name="_Toc239713413"/>
             <w:r>
               <w:rPr>
                 <w:b/>
@@ -3028,26 +3001,13 @@
               <w:rPr>
                 <w:b/>
               </w:rPr>
-              <w:t xml:space="preserve">Liân </w:t>
-            </w:r>
-            <w:r>
-              <w:rPr>
-                <w:b/>
+              <w:t xml:space="preserve">Lian Grandón. </w:t>
+            </w:r>
+            <w:r>
+              <w:rPr>
                 <w:highlight w:val="yellow"/>
               </w:rPr>
-              <w:t>[[Apellido]]</w:t>
-            </w:r>
-            <w:r>
-              <w:rPr>
-                <w:b/>
-              </w:rPr>
-              <w:t xml:space="preserve">. </w:t>
-            </w:r>
-            <w:r>
-              <w:rPr>
-                <w:highlight w:val="yellow"/>
-              </w:rPr>
-              <w:t>[[Liân: ajustar con tus palabras]]</w:t>
+              <w:t>[[Lian: ajustar con tus palabras]]</w:t>
             </w:r>
             <w:r>
               <w:t xml:space="preserve"> Me interesa el análisis y la visualización de datos aplicados a la toma de decisiones. En este proyecto desarrollo el tablero de analítica, los reportes y la administración del sistema: la parte que convierte miles de eventos en una respuesta clara para la jefatura de seguridad sobre qué EPP se incumple más, dónde y cuándo. Trabajar sobre un modelo de datos real y un contrato de API definido me permite practicar el desarrollo frontend con datos de verdad y no con maquetas.</w:t>
@@ -3206,7 +3166,7 @@
           <w:szCs w:val="32"/>
         </w:rPr>
       </w:pPr>
-      <w:bookmarkStart w:id="8" w:name="_Toc239669906"/>
+      <w:bookmarkStart w:id="8" w:name="_Toc239713414"/>
       <w:r>
         <w:rPr>
           <w:b/>
@@ -3266,7 +3226,7 @@
                 <w:szCs w:val="28"/>
               </w:rPr>
             </w:pPr>
-            <w:bookmarkStart w:id="9" w:name="_Toc239669907"/>
+            <w:bookmarkStart w:id="9" w:name="_Toc239713415"/>
             <w:r>
               <w:rPr>
                 <w:b/>
@@ -3592,7 +3552,7 @@
                 <w:szCs w:val="28"/>
               </w:rPr>
             </w:pPr>
-            <w:bookmarkStart w:id="10" w:name="_Toc239669908"/>
+            <w:bookmarkStart w:id="10" w:name="_Toc239713416"/>
             <w:r>
               <w:rPr>
                 <w:b/>
@@ -3885,7 +3845,7 @@
                 <w:szCs w:val="28"/>
               </w:rPr>
             </w:pPr>
-            <w:bookmarkStart w:id="11" w:name="_Toc239669909"/>
+            <w:bookmarkStart w:id="11" w:name="_Toc239713417"/>
             <w:r>
               <w:rPr>
                 <w:b/>
@@ -4993,7 +4953,7 @@
                 <w:szCs w:val="28"/>
               </w:rPr>
             </w:pPr>
-            <w:bookmarkStart w:id="12" w:name="_Toc239669910"/>
+            <w:bookmarkStart w:id="12" w:name="_Toc239713418"/>
             <w:r>
               <w:rPr>
                 <w:b/>
@@ -7818,7 +7778,7 @@
               <w:rPr>
                 <w:sz w:val="18"/>
               </w:rPr>
-              <w:t>Liân y Edgar</w:t>
+              <w:t>Lian y Edgar</w:t>
             </w:r>
           </w:p>
         </w:tc>
@@ -8624,7 +8584,7 @@
                 <w:szCs w:val="28"/>
               </w:rPr>
             </w:pPr>
-            <w:bookmarkStart w:id="13" w:name="_Toc239669911"/>
+            <w:bookmarkStart w:id="13" w:name="_Toc239713419"/>
             <w:r>
               <w:rPr>
                 <w:b/>
@@ -13379,7 +13339,7 @@
         <w:spacing w:before="240" w:after="120" w:line="240" w:lineRule="auto"/>
         <w:outlineLvl w:val="0"/>
       </w:pPr>
-      <w:bookmarkStart w:id="14" w:name="_Toc239669912"/>
+      <w:bookmarkStart w:id="14" w:name="_Toc239713420"/>
       <w:r>
         <w:rPr>
           <w:b/>
@@ -13438,26 +13398,13 @@
         <w:rPr>
           <w:b/>
         </w:rPr>
-        <w:t xml:space="preserve">Liân </w:t>
-      </w:r>
-      <w:r>
-        <w:rPr>
-          <w:b/>
-          <w:highlight w:val="yellow"/>
-        </w:rPr>
-        <w:t>[[Apellido]]</w:t>
-      </w:r>
-      <w:r>
-        <w:rPr>
-          <w:b/>
-        </w:rPr>
-        <w:t xml:space="preserve">. </w:t>
+        <w:t xml:space="preserve">Lian Grandón. </w:t>
       </w:r>
       <w:r>
         <w:rPr>
           <w:highlight w:val="yellow"/>
         </w:rPr>
-        <w:t>[[Liân: adjust in your own words]]</w:t>
+        <w:t>[[Lian: adjust in your own words]]</w:t>
       </w:r>
       <w:r>
         <w:t xml:space="preserve"> The most valuable lesson of Phase 1 was seeing how a data model determines what analytics are possible: because raw detections are stored per track, the dashboard can answer which PPE is missed most, where and when, without reprocessing video. In Phase 2 I will build the analytics dashboard, the reports and the administration screens, respecting the privacy rule that suppresses any cell with fewer than five people.</w:t>
@@ -13469,7 +13416,7 @@
         <w:spacing w:before="240" w:after="120" w:line="240" w:lineRule="auto"/>
         <w:outlineLvl w:val="0"/>
       </w:pPr>
-      <w:bookmarkStart w:id="15" w:name="_Toc239669913"/>
+      <w:bookmarkStart w:id="15" w:name="_Toc239713421"/>
       <w:r>
         <w:rPr>
           <w:b/>
@@ -13497,7 +13444,7 @@
         <w:spacing w:before="240" w:after="120" w:line="240" w:lineRule="auto"/>
         <w:outlineLvl w:val="0"/>
       </w:pPr>
-      <w:bookmarkStart w:id="16" w:name="_Toc239669914"/>
+      <w:bookmarkStart w:id="16" w:name="_Toc239713422"/>
       <w:r>
         <w:rPr>
           <w:b/>
@@ -13577,16 +13524,7 @@
         <w:ind w:left="567" w:hanging="567"/>
       </w:pPr>
       <w:r>
-        <w:t xml:space="preserve">Tolentino, E., Ortega, M., &amp; </w:t>
-      </w:r>
-      <w:r>
-        <w:rPr>
-          <w:highlight w:val="yellow"/>
-        </w:rPr>
-        <w:t>[[Liân]]</w:t>
-      </w:r>
-      <w:r>
-        <w:t>. (2026). Guardián EPP: documentación de producto y arquitectura (ADR 001 a 011) [Repositorio]. https://github.com/EdgarTolentino/proyecto-capstone-2026</w:t>
+        <w:t>Tolentino, E., Ortega, M., &amp; Grandón, L. (2026). Guardián EPP: documentación de producto y arquitectura (ADR 001 a 011) [Repositorio]. https://github.com/EdgarTolentino/proyecto-capstone-2026</w:t>
       </w:r>
     </w:p>
     <w:p>
@@ -13595,7 +13533,7 @@
         <w:spacing w:before="240" w:after="120" w:line="240" w:lineRule="auto"/>
         <w:outlineLvl w:val="0"/>
       </w:pPr>
-      <w:bookmarkStart w:id="17" w:name="_Toc239669915"/>
+      <w:bookmarkStart w:id="17" w:name="_Toc239713423"/>
       <w:r>
         <w:rPr>
           <w:b/>
@@ -14023,7 +13961,7 @@
         <w:spacing w:before="240" w:after="120" w:line="240" w:lineRule="auto"/>
         <w:outlineLvl w:val="0"/>
       </w:pPr>
-      <w:bookmarkStart w:id="18" w:name="_Toc239669916"/>
+      <w:bookmarkStart w:id="18" w:name="_Toc239713424"/>
       <w:r>
         <w:rPr>
           <w:b/>
@@ -14824,16 +14762,16 @@
       </w:pPr>
     </w:lvl>
   </w:abstractNum>
-  <w:num w:numId="1" w16cid:durableId="1609311579">
+  <w:num w:numId="1" w16cid:durableId="1041326083">
     <w:abstractNumId w:val="2"/>
   </w:num>
-  <w:num w:numId="2" w16cid:durableId="1553544336">
+  <w:num w:numId="2" w16cid:durableId="1237738184">
     <w:abstractNumId w:val="3"/>
   </w:num>
-  <w:num w:numId="3" w16cid:durableId="95635240">
+  <w:num w:numId="3" w16cid:durableId="1184398297">
     <w:abstractNumId w:val="0"/>
   </w:num>
-  <w:num w:numId="4" w16cid:durableId="1150634071">
+  <w:num w:numId="4" w16cid:durableId="2008046734">
     <w:abstractNumId w:val="1"/>
   </w:num>
 </w:numbering>
@@ -15561,7 +15499,7 @@
     <w:autoRedefine/>
     <w:uiPriority w:val="39"/>
     <w:unhideWhenUsed/>
-    <w:rsid w:val="0005290E"/>
+    <w:rsid w:val="00375820"/>
     <w:pPr>
       <w:spacing w:after="100"/>
     </w:pPr>
@@ -15573,7 +15511,7 @@
     <w:autoRedefine/>
     <w:uiPriority w:val="39"/>
     <w:unhideWhenUsed/>
-    <w:rsid w:val="0005290E"/>
+    <w:rsid w:val="00375820"/>
     <w:pPr>
       <w:spacing w:after="100"/>
       <w:ind w:left="220"/>
@@ -15584,7 +15522,7 @@
     <w:basedOn w:val="Fuentedeprrafopredeter"/>
     <w:uiPriority w:val="99"/>
     <w:unhideWhenUsed/>
-    <w:rsid w:val="0005290E"/>
+    <w:rsid w:val="00375820"/>
     <w:rPr>
       <w:color w:val="0563C1" w:themeColor="hyperlink"/>
       <w:u w:val="single"/>

</xml_diff>

<commit_message>
Update 1.5_GuiaEstudiante_Fase 1_Definicion Proyecto APT.docx
</commit_message>
<xml_diff>
--- a/Fase 1/Evidencias Grupales/1.5_GuiaEstudiante_Fase 1_Definicion Proyecto APT.docx
+++ b/Fase 1/Evidencias Grupales/1.5_GuiaEstudiante_Fase 1_Definicion Proyecto APT.docx
@@ -1746,13 +1746,7 @@
         <w:jc w:val="both"/>
       </w:pPr>
       <w:r>
-        <w:t>En una obra de construcción el uso de elementos de protección personal es obligatorio y su fiscalización depende de la observación humana, que es muestral, reactiva y no deja datos. Guardián EPP es una plataforma web que procesa el video que las cámaras de la obra ya producen, detecta el incumplimiento en el uso de casco y chaleco y convierte cada detección en un evento gestionable con alerta al responsable, evidencia y analítica de tendencia. La arquitectura separa un detector afinado sobre un modelo de li</w:t>
-      </w:r>
-      <w:r>
-        <w:t>cencia permisiva, un seguidor de personas, un motor de reglas configurable por zona con umbrales en segundos, un servicio de alertas con acuse de recibo y una interfaz web, sobre un modelo de datos donde el evento, y no el cuadro, es la unidad. El sistema no identifica personas y aplica privacidad por diseño. El proyecto se desarrolla en 18 semanas por un equipo de tres integrantes con una metodología iterativa e incremental, contrato de API congelado, integración continua y verificaciones bloqueantes que a</w:t>
-      </w:r>
-      <w:r>
-        <w:t>justan el alcance con datos antes de comprometerlo.</w:t>
+        <w:t>En una obra de construcción el uso de elementos de protección personal es obligatorio y su fiscalización depende de la observación humana, que es muestral, reactiva y no deja datos. Guardián EPP es una plataforma web que procesa el video que las cámaras de la obra ya producen, detecta el incumplimiento en el uso de casco y chaleco y convierte cada detección en un evento gestionable con alerta al responsable, evidencia y analítica de tendencia. La arquitectura separa un detector afinado sobre un modelo de licencia permisiva, un seguidor de personas, un motor de reglas configurable por zona con umbrales en segundos, un servicio de alertas con acuse de recibo y una interfaz web, sobre un modelo de datos donde el evento, y no el cuadro, es la unidad. El sistema no identifica personas y aplica privacidad por diseño. El proyecto se desarrolla en 18 semanas por un equipo de tres integrantes con una metodología iterativa e incremental, contrato de API congelado, integración continua y verificaciones bloqueantes que ajustan el alcance con datos antes de comprometerlo.</w:t>
       </w:r>
     </w:p>
     <w:p>
@@ -1777,13 +1771,7 @@
         <w:jc w:val="both"/>
       </w:pPr>
       <w:r>
-        <w:t>On a construction site the use of personal protective equipment (PPE) is mandatory, and its enforcement relies on human observation, which is sampled, reactive and leaves no data behind. Guardián EPP is a web platform that processes the video the site's cameras already record, detects missing helmets and reflective vests, and turns every detection into a manageable event with an alert to the person in charge, attached evidence and trend analytics. The architecture separates a detector fine-tuned on a permis</w:t>
-      </w:r>
-      <w:r>
-        <w:t xml:space="preserve">sively licensed model, a person tracker, a rule engine configurable per zone with thresholds expressed in seconds, an alert service with acknowledgement, and a web interface, all built on a data model in which the event, not the frame, is the unit. The system does not identify people and applies privacy by design. The project is developed over 18 weeks by a team of three using an iterative and incremental methodology, a frozen API contract, continuous integration, and blocking verifications that adjust the </w:t>
-      </w:r>
-      <w:r>
-        <w:t>scope with data before it is committed.</w:t>
+        <w:t>On a construction site the use of personal protective equipment (PPE) is mandatory, and its enforcement relies on human observation, which is sampled, reactive and leaves no data behind. Guardián EPP is a web platform that processes the video the site's cameras already record, detects missing helmets and reflective vests, and turns every detection into a manageable event with an alert to the person in charge, attached evidence and trend analytics. The architecture separates a detector fine-tuned on a permissively licensed model, a person tracker, a rule engine configurable per zone with thresholds expressed in seconds, an alert service with acknowledgement, and a web interface, all built on a data model in which the event, not the frame, is the unit. The system does not identify people and applies privacy by design. The project is developed over 18 weeks by a team of three using an iterative and incremental methodology, a frozen API contract, continuous integration, and blocking verifications that adjust the scope with data before it is committed.</w:t>
       </w:r>
     </w:p>
     <w:p>
@@ -2654,10 +2642,7 @@
               <w:jc w:val="both"/>
             </w:pPr>
             <w:r>
-              <w:t>Al mismo tiempo, la obra ya tiene cámaras instaladas y grabando. La infraestructura de observación continua existe; lo que falta es alguien que mire. Guardián EPP usa ese video para convertir la observación muestral y humana en observación continua y automática, y convierte cada incumplimiento en un evento estructurado que dispara una alerta al responsable, conserva la evidencia y alimenta una analítica de tendencia. El beneficio esperado es doble: reducir el tiempo entre el hecho y el aviso de días a minut</w:t>
-            </w:r>
-            <w:r>
-              <w:t>os, y responder por primera vez con datos qué EPP se incumple más, en qué zona y en qué horario.</w:t>
+              <w:t>Al mismo tiempo, la obra ya tiene cámaras instaladas y grabando. La infraestructura de observación continua existe; lo que falta es alguien que mire. Guardián EPP usa ese video para convertir la observación muestral y humana en observación continua y automática, y convierte cada incumplimiento en un evento estructurado que dispara una alerta al responsable, conserva la evidencia y alimenta una analítica de tendencia. El beneficio esperado es doble: reducir el tiempo entre el hecho y el aviso de días a minutos, y responder por primera vez con datos qué EPP se incumple más, en qué zona y en qué horario.</w:t>
             </w:r>
           </w:p>
           <w:p>
@@ -2666,10 +2651,7 @@
               <w:jc w:val="both"/>
             </w:pPr>
             <w:r>
-              <w:t>Para el campo laboral de la Ingeniería en Informática el proyecto es representativo de lo que hoy piden las empresas de seguridad industrial: integrar un modelo de visión por computador en un sistema de información completo, con base de datos, API, interfaz, pruebas y cumplimiento normativo, en particular la Ley N° 21.719 sobre protección de datos personales, cuya vigencia cae dentro de la vida del proyecto. El caso nace de la experiencia laboral del líder del equipo en una consultora de seguridad y gestión</w:t>
-            </w:r>
-            <w:r>
-              <w:t xml:space="preserve"> vial con clientes de minería e infraestructura, donde el control del uso de EPP es un problema real que hoy no tiene una solución de bajo costo.</w:t>
+              <w:t>Para el campo laboral de la Ingeniería en Informática el proyecto es representativo de lo que hoy piden las empresas de seguridad industrial: integrar un modelo de visión por computador en un sistema de información completo, con base de datos, API, interfaz, pruebas y cumplimiento normativo, en particular la Ley N° 21.719 sobre protección de datos personales, cuya vigencia cae dentro de la vida del proyecto. El caso nace de la experiencia laboral del líder del equipo en una consultora de seguridad y gestión vial con clientes de minería e infraestructura, donde el control del uso de EPP es un problema real que hoy no tiene una solución de bajo costo.</w:t>
             </w:r>
           </w:p>
         </w:tc>
@@ -2980,16 +2962,7 @@
               <w:t xml:space="preserve">Miguel Ortega. </w:t>
             </w:r>
             <w:r>
-              <w:rPr>
-                <w:highlight w:val="yellow"/>
-              </w:rPr>
-              <w:t>[[Miguel: ajustar con tus palabras]]</w:t>
-            </w:r>
-            <w:r>
-              <w:t xml:space="preserve"> Mi interés profesional está en el desarrollo de aplicaciones web y en la experiencia de usuario de herramientas operativas, donde una pantalla mal diseñada se traduce en una alerta que nadie atiende. En este proyecto construyo la bandeja de hallazgos, el visor de evidencia y la configuración de reglas en React con TypeScript, a partir de un diseño validado y de un contrato de API congelado, lo que me permite trabajar con la misma disciplina que un equipo de producto: componentes reutilizables, accesibilida</w:t>
-            </w:r>
-            <w:r>
-              <w:t>d y pruebas de interfaz.</w:t>
+              <w:t>Mi interés profesional está en el desarrollo de aplicaciones web y en la experiencia de usuario de herramientas operativas, donde una pantalla mal diseñada se traduce en una alerta que nadie atiende. En este proyecto construyo la bandeja de hallazgos, el visor de evidencia y la configuración de reglas en React con TypeScript, a partir de un diseño validado y de un contrato de API congelado, lo que me permite trabajar con la misma disciplina que un equipo de producto: componentes reutilizables, accesibilidad y pruebas de interfaz.</w:t>
             </w:r>
           </w:p>
           <w:p>
@@ -3004,13 +2977,7 @@
               <w:t xml:space="preserve">Lian Grandón. </w:t>
             </w:r>
             <w:r>
-              <w:rPr>
-                <w:highlight w:val="yellow"/>
-              </w:rPr>
-              <w:t>[[Lian: ajustar con tus palabras]]</w:t>
-            </w:r>
-            <w:r>
-              <w:t xml:space="preserve"> Me interesa el análisis y la visualización de datos aplicados a la toma de decisiones. En este proyecto desarrollo el tablero de analítica, los reportes y la administración del sistema: la parte que convierte miles de eventos en una respuesta clara para la jefatura de seguridad sobre qué EPP se incumple más, dónde y cuándo. Trabajar sobre un modelo de datos real y un contrato de API definido me permite practicar el desarrollo frontend con datos de verdad y no con maquetas.</w:t>
+              <w:t>Me interesa el análisis y la visualización de datos aplicados a la toma de decisiones. En este proyecto desarrollo el tablero de analítica, los reportes y la administración del sistema: la parte que convierte miles de eventos en una respuesta clara para la jefatura de seguridad sobre qué EPP se incumple más, dónde y cuándo. Trabajar sobre un modelo de datos real y un contrato de API definido me permite practicar el desarrollo frontend con datos de verdad y no con maquetas.</w:t>
             </w:r>
           </w:p>
         </w:tc>
@@ -3097,10 +3064,7 @@
             </w:r>
             <w:r>
               <w:lastRenderedPageBreak/>
-              <w:t>contenedores; GitHub con integración continua. Todo el software es libre (RF-DETR bajo Apache-2.0, FastAPI, React, PostgreSQL) y el entrenamiento sobre datos públicos se hace en cómputo gratuito en la nube, por lo que el costo monetario del proyecto es cero. Los datos: imágenes públicas con licencia permisiva para e</w:t>
-            </w:r>
-            <w:r>
-              <w:t>ntrenar y 20 a 30 minutos de video propio de obra para probar.</w:t>
+              <w:t>contenedores; GitHub con integración continua. Todo el software es libre (RF-DETR bajo Apache-2.0, FastAPI, React, PostgreSQL) y el entrenamiento sobre datos públicos se hace en cómputo gratuito en la nube, por lo que el costo monetario del proyecto es cero. Los datos: imágenes públicas con licencia permisiva para entrenar y 20 a 30 minutos de video propio de obra para probar.</w:t>
             </w:r>
           </w:p>
           <w:p>
@@ -3130,10 +3094,7 @@
               <w:t xml:space="preserve">Factores que dificultan y cómo se abordan. </w:t>
             </w:r>
             <w:r>
-              <w:t>Píxeles insuficientes para resolver un casco a la distancia real de la cámara: se mide antes de etiquetar y el motor de reglas nunca exige en una zona un EPP que la cámara no alcanza a resolver. No conseguir video propio: se graba en la semana 5 con autorización escrita y consentimiento informado, y el plan B es un escenario simulado por el equipo con la misma arquitectura. Una sola GPU: se entrena en la nube gratuita con datos públicos y la máquina local se reserva para inferencia. Etiquetado que se come e</w:t>
-            </w:r>
-            <w:r>
-              <w:t>l semestre: pre-etiquetado automático y solo corrección humana, repartida entre los tres. Frontend esperando al backend: contrato de API congelado y servidor simulado desde la semana 4. Ley N° 21.719: privacidad por diseño, sin identificación de personas y con base de licitud y retención registradas en la base de datos.</w:t>
+              <w:t>Píxeles insuficientes para resolver un casco a la distancia real de la cámara: se mide antes de etiquetar y el motor de reglas nunca exige en una zona un EPP que la cámara no alcanza a resolver. No conseguir video propio: se graba en la semana 5 con autorización escrita y consentimiento informado, y el plan B es un escenario simulado por el equipo con la misma arquitectura. Una sola GPU: se entrena en la nube gratuita con datos públicos y la máquina local se reserva para inferencia. Etiquetado que se come el semestre: pre-etiquetado automático y solo corrección humana, repartida entre los tres. Frontend esperando al backend: contrato de API congelado y servidor simulado desde la semana 4. Ley N° 21.719: privacidad por diseño, sin identificación de personas y con base de licitud y retención registradas en la base de datos.</w:t>
             </w:r>
           </w:p>
         </w:tc>
@@ -13362,10 +13323,7 @@
         <w:t xml:space="preserve">Edgar Tolentino. </w:t>
       </w:r>
       <w:r>
-        <w:t>Phase 1 confirmed something I suspected from work: the hard part of a computer vision product is not the model, it is everything around it. Deciding that the event is the unit of the system, that thresholds live in seconds and not in frames, and that the rule engine must never demand a PPE the camera cannot resolve, shaped the architecture more than any choice of network. Adding up my hours against the eleven development weeks also forced an honest decision: version 1 commits to helmet and vest, labelling i</w:t>
-      </w:r>
-      <w:r>
-        <w:t>s a team task, and the vision-language model is a demonstrated extension, not a requirement. I would rather defend a smaller system that works end to end than a larger one that does not.</w:t>
+        <w:t>Phase 1 confirmed something I suspected from work: the hard part of a computer vision product is not the model, it is everything around it. Deciding that the event is the unit of the system, that thresholds live in seconds and not in frames, and that the rule engine must never demand a PPE the camera cannot resolve, shaped the architecture more than any choice of network. Adding up my hours against the eleven development weeks also forced an honest decision: version 1 commits to helmet and vest, labelling is a team task, and the vision-language model is a demonstrated extension, not a requirement. I would rather defend a smaller system that works end to end than a larger one that does not.</w:t>
       </w:r>
     </w:p>
     <w:p>
@@ -13377,16 +13335,16 @@
         <w:rPr>
           <w:b/>
         </w:rPr>
-        <w:t xml:space="preserve">Miguel Ortega. </w:t>
+        <w:t>Miguel Ortega</w:t>
       </w:r>
       <w:r>
         <w:rPr>
-          <w:highlight w:val="yellow"/>
+          <w:b/>
         </w:rPr>
-        <w:t>[[Miguel: adjust in your own words]]</w:t>
+        <w:t xml:space="preserve">. </w:t>
       </w:r>
       <w:r>
-        <w:t xml:space="preserve"> During this phase I learned that a frontend can start before the backend exists when the API contract is frozen and a mock server is available. Working from an approved design with extracted tokens lets me focus on building reusable, accessible components instead of guessing what the data will look like. My goal for Phase 2 is to deliver the findings inbox and the evidence viewer early enough to test them with real events by week 9.</w:t>
+        <w:t>During this phase I learned that a frontend can start before the backend exists when the API contract is frozen and a mock server is available. Working from an approved design with extracted tokens lets me focus on building reusable, accessible components instead of guessing what the data will look like. My goal for Phase 2 is to deliver the findings inbox and the evidence viewer early enough to test them with real events by week 9.</w:t>
       </w:r>
     </w:p>
     <w:p>
@@ -13401,13 +13359,7 @@
         <w:t xml:space="preserve">Lian Grandón. </w:t>
       </w:r>
       <w:r>
-        <w:rPr>
-          <w:highlight w:val="yellow"/>
-        </w:rPr>
-        <w:t>[[Lian: adjust in your own words]]</w:t>
-      </w:r>
-      <w:r>
-        <w:t xml:space="preserve"> The most valuable lesson of Phase 1 was seeing how a data model determines what analytics are possible: because raw detections are stored per track, the dashboard can answer which PPE is missed most, where and when, without reprocessing video. In Phase 2 I will build the analytics dashboard, the reports and the administration screens, respecting the privacy rule that suppresses any cell with fewer than five people.</w:t>
+        <w:t>The most valuable lesson of Phase 1 was seeing how a data model determines what analytics are possible: because raw detections are stored per track, the dashboard can answer which PPE is missed most, where and when, without reprocessing video. In Phase 2 I will build the analytics dashboard, the reports and the administration screens, respecting the privacy rule that suppresses any cell with fewer than five people.</w:t>
       </w:r>
     </w:p>
     <w:p>
@@ -13432,10 +13384,7 @@
         <w:jc w:val="both"/>
       </w:pPr>
       <w:r>
-        <w:t>As a team, Phase 1 taught us to verify before committing. Our first plan assumed access to mining site video and a five-week internal regulation process; checking that assumption moved the evaluated domain to a construction site and freed five weeks of development. Our second assumption, that a helmet is always visible enough to be detected, turned out to be true only in part of the frame, which is why the rule engine now respects a per-zone table of what each camera can actually resolve. We also learned to</w:t>
-      </w:r>
-      <w:r>
-        <w:t xml:space="preserve"> split the work so that nobody waits: the API contract was frozen in week 4 and the frontend builds against a mock server. Finally, adding up the hours showed that the original scope did not fit, and we chose to reduce it with numbers rather than hope. We enter Phase 2 with a smaller, clearer commitment and a repository where every decision is written down with its alternatives.</w:t>
+        <w:t>As a team, Phase 1 taught us to verify before committing. Our first plan assumed access to mining site video and a five-week internal regulation process; checking that assumption moved the evaluated domain to a construction site and freed five weeks of development. Our second assumption, that a helmet is always visible enough to be detected, turned out to be true only in part of the frame, which is why the rule engine now respects a per-zone table of what each camera can actually resolve. We also learned to split the work so that nobody waits: the API contract was frozen in week 4 and the frontend builds against a mock server. Finally, adding up the hours showed that the original scope did not fit, and we chose to reduce it with numbers rather than hope. We enter Phase 2 with a smaller, clearer commitment and a repository where every decision is written down with its alternatives.</w:t>
       </w:r>
     </w:p>
     <w:p>
@@ -15827,21 +15776,6 @@
 </file>
 
 <file path=customXml/item1.xml><?xml version="1.0" encoding="utf-8"?>
-<p:properties xmlns:p="http://schemas.microsoft.com/office/2006/metadata/properties" xmlns:xsi="http://www.w3.org/2001/XMLSchema-instance" xmlns:pc="http://schemas.microsoft.com/office/infopath/2007/PartnerControls">
-  <documentManagement/>
-</p:properties>
-</file>
-
-<file path=customXml/item2.xml><?xml version="1.0" encoding="utf-8"?>
-<?mso-contentType ?>
-<FormTemplates xmlns="http://schemas.microsoft.com/sharepoint/v3/contenttype/forms">
-  <Display>DocumentLibraryForm</Display>
-  <Edit>DocumentLibraryForm</Edit>
-  <New>DocumentLibraryForm</New>
-</FormTemplates>
-</file>
-
-<file path=customXml/item3.xml><?xml version="1.0" encoding="utf-8"?>
 <ct:contentTypeSchema xmlns:ct="http://schemas.microsoft.com/office/2006/metadata/contentType" xmlns:ma="http://schemas.microsoft.com/office/2006/metadata/properties/metaAttributes" ct:_="" ma:_="" ma:contentTypeName="Documento" ma:contentTypeID="0x010100E96778489EE7714D8BD12CC105EB918B" ma:contentTypeVersion="2" ma:contentTypeDescription="Crear nuevo documento." ma:contentTypeScope="" ma:versionID="416c5c7ae9b5d54d83875cd3c65194e3">
   <xsd:schema xmlns:xsd="http://www.w3.org/2001/XMLSchema" xmlns:xs="http://www.w3.org/2001/XMLSchema" xmlns:p="http://schemas.microsoft.com/office/2006/metadata/properties" xmlns:ns2="126e8a1c-9ea9-435a-ac89-d06c80d62e30" targetNamespace="http://schemas.microsoft.com/office/2006/metadata/properties" ma:root="true" ma:fieldsID="70a237c842677bd850644f8595079f5e" ns2:_="">
     <xsd:import namespace="126e8a1c-9ea9-435a-ac89-d06c80d62e30"/>
@@ -15973,24 +15907,22 @@
 </ct:contentTypeSchema>
 </file>
 
-<file path=customXml/itemProps1.xml><?xml version="1.0" encoding="utf-8"?>
-<ds:datastoreItem xmlns:ds="http://schemas.openxmlformats.org/officeDocument/2006/customXml" ds:itemID="{38174882-579A-45DC-A704-C035A9357F73}">
-  <ds:schemaRefs>
-    <ds:schemaRef ds:uri="http://schemas.microsoft.com/office/2006/metadata/properties"/>
-    <ds:schemaRef ds:uri="http://schemas.microsoft.com/office/infopath/2007/PartnerControls"/>
-  </ds:schemaRefs>
-</ds:datastoreItem>
+<file path=customXml/item2.xml><?xml version="1.0" encoding="utf-8"?>
+<?mso-contentType ?>
+<FormTemplates xmlns="http://schemas.microsoft.com/sharepoint/v3/contenttype/forms">
+  <Display>DocumentLibraryForm</Display>
+  <Edit>DocumentLibraryForm</Edit>
+  <New>DocumentLibraryForm</New>
+</FormTemplates>
 </file>
 
-<file path=customXml/itemProps2.xml><?xml version="1.0" encoding="utf-8"?>
-<ds:datastoreItem xmlns:ds="http://schemas.openxmlformats.org/officeDocument/2006/customXml" ds:itemID="{F3E3E2F7-59E7-4722-B872-D023DC9D1CC1}">
-  <ds:schemaRefs>
-    <ds:schemaRef ds:uri="http://schemas.microsoft.com/sharepoint/v3/contenttype/forms"/>
-  </ds:schemaRefs>
-</ds:datastoreItem>
+<file path=customXml/item3.xml><?xml version="1.0" encoding="utf-8"?>
+<p:properties xmlns:p="http://schemas.microsoft.com/office/2006/metadata/properties" xmlns:xsi="http://www.w3.org/2001/XMLSchema-instance" xmlns:pc="http://schemas.microsoft.com/office/infopath/2007/PartnerControls">
+  <documentManagement/>
+</p:properties>
 </file>
 
-<file path=customXml/itemProps3.xml><?xml version="1.0" encoding="utf-8"?>
+<file path=customXml/itemProps1.xml><?xml version="1.0" encoding="utf-8"?>
 <ds:datastoreItem xmlns:ds="http://schemas.openxmlformats.org/officeDocument/2006/customXml" ds:itemID="{7C9B9CFF-B258-43B4-948A-968A031773F5}">
   <ds:schemaRefs>
     <ds:schemaRef ds:uri="http://schemas.microsoft.com/office/2006/metadata/contentType"/>
@@ -16006,4 +15938,21 @@
     <ds:schemaRef ds:uri="http://schemas.microsoft.com/internal/obd"/>
   </ds:schemaRefs>
 </ds:datastoreItem>
+</file>
+
+<file path=customXml/itemProps2.xml><?xml version="1.0" encoding="utf-8"?>
+<ds:datastoreItem xmlns:ds="http://schemas.openxmlformats.org/officeDocument/2006/customXml" ds:itemID="{F3E3E2F7-59E7-4722-B872-D023DC9D1CC1}">
+  <ds:schemaRefs>
+    <ds:schemaRef ds:uri="http://schemas.microsoft.com/sharepoint/v3/contenttype/forms"/>
+  </ds:schemaRefs>
+</ds:datastoreItem>
+</file>
+
+<file path=customXml/itemProps3.xml><?xml version="1.0" encoding="utf-8"?>
+<ds:datastoreItem xmlns:ds="http://schemas.openxmlformats.org/officeDocument/2006/customXml" ds:itemID="{38174882-579A-45DC-A704-C035A9357F73}">
+  <ds:schemaRefs>
+    <ds:schemaRef ds:uri="http://schemas.microsoft.com/office/2006/metadata/properties"/>
+    <ds:schemaRef ds:uri="http://schemas.microsoft.com/office/infopath/2007/PartnerControls"/>
+  </ds:schemaRefs>
+</ds:datastoreItem>
 </file>
</xml_diff>